<commit_message>
Add Sarcasm Corpus V2 provenance paragraph (source, collection, purpose)
Section 3.2: describes the corpus's origin (Internet Argument Corpus,
30K randomly sampled debate-forum posts), the Mechanical Turk annotation
protocol (quote-response context, qualifying test, 6-of-9 agreement
threshold), the GEN/HYP/RQ subset construction methods, and the paper's
stated motivation -- sourced from the Oraby et al. (2016) paper itself,
not from memory.
</commit_message>
<xml_diff>
--- a/Sarcasm_Project_Report.docx
+++ b/Sarcasm_Project_Report.docx
@@ -8956,6 +8956,12 @@
         </w:rPr>
         <w:lastRenderedPageBreak/>
         <w:t>author appended a marker such as #sarcasm; models trained on such data can reach high scores by learning the marker's lexical company rather than sarcasm itself, and the labels are missing precisely on the sarcastic posts whose authors saw no need to flag them. Human annotation over forum text avoids that shortcut, at the cost of a smaller corpus and of labels that reflect annotator judgement, with the residual disagreement that judgement implies.</w:t>
+      </w:r>
+    </w:p>
+    <w:p>
+      <w:pPr/>
+      <w:r>
+        <w:t>The source text traces back to the Internet Argument Corpus (IAC 2.0), a collection of roughly 400,000 posts drawn from online debate forums; Oraby et al. randomly sampled 30,000 posts (10-150 words each) from IAC as the pool for this corpus. Because natural sarcasm prevalence in debate-forum text is low (about 12%) and prior sarcasm corpora suffered from poor inter-annotator agreement, the authors built in two safeguards before any human ever saw the data. First, distribution skew: the not-sarcastic candidate pool was pre-filtered with high-precision sincere-language patterns (AutoSlog-TS), removing about two-thirds of clearly-sincere posts so annotators would see a more balanced, higher-signal sample rather than searching for a rare label in a mostly-sincere stream. Second, quality-controlled crowdsourcing: sarcasm labels were collected on Amazon Mechanical Turk, with each post shown as a quote-response pair (i.e. with its immediate thread context, not in isolation), annotators given an explicit definition of sarcasm plus one worked example of each class, and only workers scoring above 70% on a 20-item (10 sarcastic / 10 not) qualifying test allowed to annotate. A post entered the sarcastic set only if at least 6 of 9 independent annotators agreed (a stricter, supplementary pass used 2-of-3 agreement among a smaller pool of highly-reliable annotators) - a substantially higher-agreement bar than single-annotator or hashtag-based sarcasm labeling typically achieves. The hyperbole (HYP) and rhetorical-question (RQ) subsets were identified separately, before annotation, using hand-written linguistic pattern matchers: HYP via intensifier-plus-extreme-adjective patterns (e.g. "absolutely amazing"), RQ via a mid-post question immediately followed by a statement, on the premise that such a structure signals a rhetorical rather than an information-seeking question. The dataset's stated purpose was precisely to give the field a larger, more diverse, higher-agreement corpus than was previously available, one that could support reliable supervised learning and a systematic study of sarcasm's semantic subtypes rather than treating sarcasm as one undifferentiated phenomenon - the same three-subset structure (GEN/HYP/RQ) this project's category-level error analysis (Section 3.7) relies on directly.</w:t>
       </w:r>
     </w:p>
     <w:p>

</xml_diff>

<commit_message>
Describe the manual review pass in Part III's error-analysis section
Section 4.5: adds a paragraph explaining that the Task A/B error-analysis
findings came from a manual, row-by-row review of predictions joined
against the source SIGN text (not from aggregate metrics alone) --
this direct reading is what surfaced the duplicate-interpretation
data-quality finding in section 4.6.
</commit_message>
<xml_diff>
--- a/Sarcasm_Project_Report.docx
+++ b/Sarcasm_Project_Report.docx
@@ -16603,6 +16603,12 @@
       </w:pPr>
       <w:r>
         <w:t>4.5 What Kinds of SIGN Sarcasm Do the Models Fail to Detect?</w:t>
+      </w:r>
+    </w:p>
+    <w:p>
+      <w:pPr/>
+      <w:r>
+        <w:t>This section and the next report the outcome of a manual review pass conducted directly on the predictions once all six methods had been run zero-transfer on SIGN for the first time (Section 4.1's results). Rather than trusting the aggregate Task A/Task B metrics alone, every prediction file was joined against the underlying SIGN text and read case by case: every original ever missed by at least one method (148 of 265), every interpretation ever flagged sarcastic by at least one method (1,400 of 1,470), and in particular the subset every method agreed on -- both the 117 universally-detected originals and the 427 interpretations every method flagged as sarcastic. This direct, row-by-row reading is what surfaced the section 4.6 finding that a real fraction of the "universally wrong" interpretations are byte-identical to their own sarcastic original -- a data-quality property no aggregate metric would have revealed on its own, since it only becomes visible once a human actually opens the flagged rows and compares them against the source text. The qualitative patterns in this section (polarity-reversal irony vs. world-knowledge-dependent cases) came from the same close reading of the universally-easy and universally-hard subsets, not from an automated classifier of difficulty.</w:t>
       </w:r>
     </w:p>
     <w:p>

</xml_diff>

<commit_message>
Remove outdated poster file and add temporary report file
</commit_message>
<xml_diff>
--- a/Sarcasm_Project_Report.docx
+++ b/Sarcasm_Project_Report.docx
@@ -28,13 +28,20 @@
       <w:pPr>
         <w:spacing w:after="800" w:line="360" w:lineRule="auto"/>
         <w:jc w:val="center"/>
-      </w:pPr>
-      <w:r>
-        <w:rPr>
+        <w:rPr>
+          <w:rFonts w:hint="cs"/>
+          <w:lang w:bidi="he-IL"/>
+        </w:rPr>
+      </w:pPr>
+      <w:r>
+        <w:rPr>
+          <w:rFonts w:hint="cs"/>
           <w:color w:val="52514E"/>
           <w:sz w:val="24"/>
-        </w:rPr>
-        <w:t>Final-Year Project in Design</w:t>
+          <w:rtl/>
+          <w:lang w:bidi="he-IL"/>
+        </w:rPr>
+        <w:t xml:space="preserve"> </w:t>
       </w:r>
     </w:p>
     <w:p>
@@ -68,11 +75,12 @@
       </w:pPr>
       <w:r>
         <w:rPr>
+          <w:rFonts w:cs="Calibri"/>
           <w:i/>
           <w:color w:val="256ABF"/>
           <w:sz w:val="28"/>
         </w:rPr>
-        <w:t>A Two-Phase Study in Sarcastic-Text Neutralization and Classification,</w:t>
+        <w:t>From LLM Prompting to a Fine</w:t>
       </w:r>
       <w:r>
         <w:rPr>
@@ -80,8 +88,50 @@
           <w:color w:val="256ABF"/>
           <w:sz w:val="28"/>
         </w:rPr>
+        <w:t>-</w:t>
+      </w:r>
+      <w:r>
+        <w:rPr>
+          <w:rFonts w:cs="Calibri"/>
+          <w:i/>
+          <w:color w:val="256ABF"/>
+          <w:sz w:val="28"/>
+        </w:rPr>
+        <w:t>Tuned Transformer Encoder:</w:t>
+      </w:r>
+      <w:r>
+        <w:rPr>
+          <w:i/>
+          <w:color w:val="256ABF"/>
+          <w:sz w:val="28"/>
+        </w:rPr>
         <w:br/>
-        <w:t>from LLM Prompting to a Fine-Tuned Transformer Encoder</w:t>
+      </w:r>
+      <w:r>
+        <w:rPr>
+          <w:rFonts w:cs="Calibri"/>
+          <w:i/>
+          <w:color w:val="256ABF"/>
+          <w:sz w:val="28"/>
+        </w:rPr>
+        <w:t>What Task</w:t>
+      </w:r>
+      <w:r>
+        <w:rPr>
+          <w:i/>
+          <w:color w:val="256ABF"/>
+          <w:sz w:val="28"/>
+        </w:rPr>
+        <w:t>-</w:t>
+      </w:r>
+      <w:r>
+        <w:rPr>
+          <w:rFonts w:cs="Calibri"/>
+          <w:i/>
+          <w:color w:val="256ABF"/>
+          <w:sz w:val="28"/>
+        </w:rPr>
+        <w:t>Specific Training Buys over Prompt Engineering</w:t>
       </w:r>
     </w:p>
     <w:p>
@@ -339,7 +389,15 @@
           <w:color w:val="52514E"/>
           <w:sz w:val="24"/>
         </w:rPr>
-        <w:t>August 2026</w:t>
+        <w:t>Spring</w:t>
+      </w:r>
+      <w:r>
+        <w:rPr>
+          <w:rFonts w:cs="Calibri"/>
+          <w:color w:val="52514E"/>
+          <w:sz w:val="24"/>
+        </w:rPr>
+        <w:t xml:space="preserve"> 2026</w:t>
       </w:r>
     </w:p>
     <w:p>
@@ -347,7 +405,7 @@
         <w:pStyle w:val="Heading1"/>
         <w:spacing w:line="360" w:lineRule="auto"/>
       </w:pPr>
-      <w:bookmarkStart w:id="0" w:name="_Toc237877526"/>
+      <w:bookmarkStart w:id="0" w:name="_Toc238317407"/>
       <w:r>
         <w:lastRenderedPageBreak/>
         <w:t>Abstract</w:t>
@@ -399,7 +457,7 @@
         <w:pStyle w:val="Heading1"/>
         <w:spacing w:line="360" w:lineRule="auto"/>
       </w:pPr>
-      <w:bookmarkStart w:id="1" w:name="_Toc237877527"/>
+      <w:bookmarkStart w:id="1" w:name="_Toc238317408"/>
       <w:r>
         <w:lastRenderedPageBreak/>
         <w:t>Table of Contents</w:t>
@@ -432,7 +490,7 @@
       <w:r>
         <w:fldChar w:fldCharType="separate"/>
       </w:r>
-      <w:hyperlink w:anchor="_Toc237877526" w:history="1">
+      <w:hyperlink w:anchor="_Toc238317407" w:history="1">
         <w:r>
           <w:rPr>
             <w:rStyle w:val="Hyperlink"/>
@@ -459,7 +517,7 @@
             <w:noProof/>
             <w:webHidden/>
           </w:rPr>
-          <w:instrText xml:space="preserve"> PAGEREF _Toc237877526 \h </w:instrText>
+          <w:instrText xml:space="preserve"> PAGEREF _Toc238317407 \h </w:instrText>
         </w:r>
         <w:r>
           <w:rPr>
@@ -507,7 +565,7 @@
           <w14:ligatures w14:val="standardContextual"/>
         </w:rPr>
       </w:pPr>
-      <w:hyperlink w:anchor="_Toc237877527" w:history="1">
+      <w:hyperlink w:anchor="_Toc238317408" w:history="1">
         <w:r>
           <w:rPr>
             <w:rStyle w:val="Hyperlink"/>
@@ -534,7 +592,7 @@
             <w:noProof/>
             <w:webHidden/>
           </w:rPr>
-          <w:instrText xml:space="preserve"> PAGEREF _Toc237877527 \h </w:instrText>
+          <w:instrText xml:space="preserve"> PAGEREF _Toc238317408 \h </w:instrText>
         </w:r>
         <w:r>
           <w:rPr>
@@ -582,7 +640,7 @@
           <w14:ligatures w14:val="standardContextual"/>
         </w:rPr>
       </w:pPr>
-      <w:hyperlink w:anchor="_Toc237877528" w:history="1">
+      <w:hyperlink w:anchor="_Toc238317409" w:history="1">
         <w:r>
           <w:rPr>
             <w:rStyle w:val="Hyperlink"/>
@@ -609,7 +667,7 @@
             <w:noProof/>
             <w:webHidden/>
           </w:rPr>
-          <w:instrText xml:space="preserve"> PAGEREF _Toc237877528 \h </w:instrText>
+          <w:instrText xml:space="preserve"> PAGEREF _Toc238317409 \h </w:instrText>
         </w:r>
         <w:r>
           <w:rPr>
@@ -657,7 +715,7 @@
           <w14:ligatures w14:val="standardContextual"/>
         </w:rPr>
       </w:pPr>
-      <w:hyperlink w:anchor="_Toc237877529" w:history="1">
+      <w:hyperlink w:anchor="_Toc238317410" w:history="1">
         <w:r>
           <w:rPr>
             <w:rStyle w:val="Hyperlink"/>
@@ -684,7 +742,7 @@
             <w:noProof/>
             <w:webHidden/>
           </w:rPr>
-          <w:instrText xml:space="preserve"> PAGEREF _Toc237877529 \h </w:instrText>
+          <w:instrText xml:space="preserve"> PAGEREF _Toc238317410 \h </w:instrText>
         </w:r>
         <w:r>
           <w:rPr>
@@ -732,13 +790,13 @@
           <w14:ligatures w14:val="standardContextual"/>
         </w:rPr>
       </w:pPr>
-      <w:hyperlink w:anchor="_Toc237877530" w:history="1">
+      <w:hyperlink w:anchor="_Toc238317411" w:history="1">
         <w:r>
           <w:rPr>
             <w:rStyle w:val="Hyperlink"/>
             <w:noProof/>
           </w:rPr>
-          <w:t>1.2 Project Structure and Two-Phase Scope</w:t>
+          <w:t>1.2 Project Structure and Scope</w:t>
         </w:r>
         <w:r>
           <w:rPr>
@@ -759,7 +817,7 @@
             <w:noProof/>
             <w:webHidden/>
           </w:rPr>
-          <w:instrText xml:space="preserve"> PAGEREF _Toc237877530 \h </w:instrText>
+          <w:instrText xml:space="preserve"> PAGEREF _Toc238317411 \h </w:instrText>
         </w:r>
         <w:r>
           <w:rPr>
@@ -807,7 +865,7 @@
           <w14:ligatures w14:val="standardContextual"/>
         </w:rPr>
       </w:pPr>
-      <w:hyperlink w:anchor="_Toc237877531" w:history="1">
+      <w:hyperlink w:anchor="_Toc238317412" w:history="1">
         <w:r>
           <w:rPr>
             <w:rStyle w:val="Hyperlink"/>
@@ -834,7 +892,7 @@
             <w:noProof/>
             <w:webHidden/>
           </w:rPr>
-          <w:instrText xml:space="preserve"> PAGEREF _Toc237877531 \h </w:instrText>
+          <w:instrText xml:space="preserve"> PAGEREF _Toc238317412 \h </w:instrText>
         </w:r>
         <w:r>
           <w:rPr>
@@ -882,27 +940,13 @@
           <w14:ligatures w14:val="standardContextual"/>
         </w:rPr>
       </w:pPr>
-      <w:hyperlink w:anchor="_Toc237877532" w:history="1">
+      <w:hyperlink w:anchor="_Toc238317413" w:history="1">
         <w:r>
           <w:rPr>
             <w:rStyle w:val="Hyperlink"/>
             <w:noProof/>
           </w:rPr>
-          <w:t xml:space="preserve">2. Part I </w:t>
-        </w:r>
-        <w:r>
-          <w:rPr>
-            <w:rStyle w:val="Hyperlink"/>
-            <w:noProof/>
-          </w:rPr>
-          <w:t>-</w:t>
-        </w:r>
-        <w:r>
-          <w:rPr>
-            <w:rStyle w:val="Hyperlink"/>
-            <w:noProof/>
-          </w:rPr>
-          <w:t xml:space="preserve"> Sarcasm Interpretation Benchmark</w:t>
+          <w:t>2. Part I - Sarcasm Interpretation Benchmark</w:t>
         </w:r>
         <w:r>
           <w:rPr>
@@ -923,7 +967,7 @@
             <w:noProof/>
             <w:webHidden/>
           </w:rPr>
-          <w:instrText xml:space="preserve"> PAGEREF _Toc237877532 \h </w:instrText>
+          <w:instrText xml:space="preserve"> PAGEREF _Toc238317413 \h </w:instrText>
         </w:r>
         <w:r>
           <w:rPr>
@@ -971,7 +1015,7 @@
           <w14:ligatures w14:val="standardContextual"/>
         </w:rPr>
       </w:pPr>
-      <w:hyperlink w:anchor="_Toc237877533" w:history="1">
+      <w:hyperlink w:anchor="_Toc238317414" w:history="1">
         <w:r>
           <w:rPr>
             <w:rStyle w:val="Hyperlink"/>
@@ -998,7 +1042,7 @@
             <w:noProof/>
             <w:webHidden/>
           </w:rPr>
-          <w:instrText xml:space="preserve"> PAGEREF _Toc237877533 \h </w:instrText>
+          <w:instrText xml:space="preserve"> PAGEREF _Toc238317414 \h </w:instrText>
         </w:r>
         <w:r>
           <w:rPr>
@@ -1046,7 +1090,7 @@
           <w14:ligatures w14:val="standardContextual"/>
         </w:rPr>
       </w:pPr>
-      <w:hyperlink w:anchor="_Toc237877534" w:history="1">
+      <w:hyperlink w:anchor="_Toc238317415" w:history="1">
         <w:r>
           <w:rPr>
             <w:rStyle w:val="Hyperlink"/>
@@ -1073,7 +1117,7 @@
             <w:noProof/>
             <w:webHidden/>
           </w:rPr>
-          <w:instrText xml:space="preserve"> PAGEREF _Toc237877534 \h </w:instrText>
+          <w:instrText xml:space="preserve"> PAGEREF _Toc238317415 \h </w:instrText>
         </w:r>
         <w:r>
           <w:rPr>
@@ -1121,7 +1165,7 @@
           <w14:ligatures w14:val="standardContextual"/>
         </w:rPr>
       </w:pPr>
-      <w:hyperlink w:anchor="_Toc237877535" w:history="1">
+      <w:hyperlink w:anchor="_Toc238317416" w:history="1">
         <w:r>
           <w:rPr>
             <w:rStyle w:val="Hyperlink"/>
@@ -1148,7 +1192,7 @@
             <w:noProof/>
             <w:webHidden/>
           </w:rPr>
-          <w:instrText xml:space="preserve"> PAGEREF _Toc237877535 \h </w:instrText>
+          <w:instrText xml:space="preserve"> PAGEREF _Toc238317416 \h </w:instrText>
         </w:r>
         <w:r>
           <w:rPr>
@@ -1196,7 +1240,7 @@
           <w14:ligatures w14:val="standardContextual"/>
         </w:rPr>
       </w:pPr>
-      <w:hyperlink w:anchor="_Toc237877536" w:history="1">
+      <w:hyperlink w:anchor="_Toc238317417" w:history="1">
         <w:r>
           <w:rPr>
             <w:rStyle w:val="Hyperlink"/>
@@ -1223,7 +1267,7 @@
             <w:noProof/>
             <w:webHidden/>
           </w:rPr>
-          <w:instrText xml:space="preserve"> PAGEREF _Toc237877536 \h </w:instrText>
+          <w:instrText xml:space="preserve"> PAGEREF _Toc238317417 \h </w:instrText>
         </w:r>
         <w:r>
           <w:rPr>
@@ -1271,7 +1315,7 @@
           <w14:ligatures w14:val="standardContextual"/>
         </w:rPr>
       </w:pPr>
-      <w:hyperlink w:anchor="_Toc237877537" w:history="1">
+      <w:hyperlink w:anchor="_Toc238317418" w:history="1">
         <w:r>
           <w:rPr>
             <w:rStyle w:val="Hyperlink"/>
@@ -1298,7 +1342,7 @@
             <w:noProof/>
             <w:webHidden/>
           </w:rPr>
-          <w:instrText xml:space="preserve"> PAGEREF _Toc237877537 \h </w:instrText>
+          <w:instrText xml:space="preserve"> PAGEREF _Toc238317418 \h </w:instrText>
         </w:r>
         <w:r>
           <w:rPr>
@@ -1346,7 +1390,7 @@
           <w14:ligatures w14:val="standardContextual"/>
         </w:rPr>
       </w:pPr>
-      <w:hyperlink w:anchor="_Toc237877538" w:history="1">
+      <w:hyperlink w:anchor="_Toc238317419" w:history="1">
         <w:r>
           <w:rPr>
             <w:rStyle w:val="Hyperlink"/>
@@ -1373,7 +1417,7 @@
             <w:noProof/>
             <w:webHidden/>
           </w:rPr>
-          <w:instrText xml:space="preserve"> PAGEREF _Toc237877538 \h </w:instrText>
+          <w:instrText xml:space="preserve"> PAGEREF _Toc238317419 \h </w:instrText>
         </w:r>
         <w:r>
           <w:rPr>
@@ -1421,7 +1465,7 @@
           <w14:ligatures w14:val="standardContextual"/>
         </w:rPr>
       </w:pPr>
-      <w:hyperlink w:anchor="_Toc237877539" w:history="1">
+      <w:hyperlink w:anchor="_Toc238317420" w:history="1">
         <w:r>
           <w:rPr>
             <w:rStyle w:val="Hyperlink"/>
@@ -1448,7 +1492,7 @@
             <w:noProof/>
             <w:webHidden/>
           </w:rPr>
-          <w:instrText xml:space="preserve"> PAGEREF _Toc237877539 \h </w:instrText>
+          <w:instrText xml:space="preserve"> PAGEREF _Toc238317420 \h </w:instrText>
         </w:r>
         <w:r>
           <w:rPr>
@@ -1496,7 +1540,7 @@
           <w14:ligatures w14:val="standardContextual"/>
         </w:rPr>
       </w:pPr>
-      <w:hyperlink w:anchor="_Toc237877540" w:history="1">
+      <w:hyperlink w:anchor="_Toc238317421" w:history="1">
         <w:r>
           <w:rPr>
             <w:rStyle w:val="Hyperlink"/>
@@ -1523,7 +1567,7 @@
             <w:noProof/>
             <w:webHidden/>
           </w:rPr>
-          <w:instrText xml:space="preserve"> PAGEREF _Toc237877540 \h </w:instrText>
+          <w:instrText xml:space="preserve"> PAGEREF _Toc238317421 \h </w:instrText>
         </w:r>
         <w:r>
           <w:rPr>
@@ -1571,7 +1615,7 @@
           <w14:ligatures w14:val="standardContextual"/>
         </w:rPr>
       </w:pPr>
-      <w:hyperlink w:anchor="_Toc237877541" w:history="1">
+      <w:hyperlink w:anchor="_Toc238317422" w:history="1">
         <w:r>
           <w:rPr>
             <w:rStyle w:val="Hyperlink"/>
@@ -1598,7 +1642,7 @@
             <w:noProof/>
             <w:webHidden/>
           </w:rPr>
-          <w:instrText xml:space="preserve"> PAGEREF _Toc237877541 \h </w:instrText>
+          <w:instrText xml:space="preserve"> PAGEREF _Toc238317422 \h </w:instrText>
         </w:r>
         <w:r>
           <w:rPr>
@@ -1646,7 +1690,7 @@
           <w14:ligatures w14:val="standardContextual"/>
         </w:rPr>
       </w:pPr>
-      <w:hyperlink w:anchor="_Toc237877542" w:history="1">
+      <w:hyperlink w:anchor="_Toc238317423" w:history="1">
         <w:r>
           <w:rPr>
             <w:rStyle w:val="Hyperlink"/>
@@ -1673,7 +1717,7 @@
             <w:noProof/>
             <w:webHidden/>
           </w:rPr>
-          <w:instrText xml:space="preserve"> PAGEREF _Toc237877542 \h </w:instrText>
+          <w:instrText xml:space="preserve"> PAGEREF _Toc238317423 \h </w:instrText>
         </w:r>
         <w:r>
           <w:rPr>
@@ -1721,7 +1765,7 @@
           <w14:ligatures w14:val="standardContextual"/>
         </w:rPr>
       </w:pPr>
-      <w:hyperlink w:anchor="_Toc237877543" w:history="1">
+      <w:hyperlink w:anchor="_Toc238317424" w:history="1">
         <w:r>
           <w:rPr>
             <w:rStyle w:val="Hyperlink"/>
@@ -1748,7 +1792,7 @@
             <w:noProof/>
             <w:webHidden/>
           </w:rPr>
-          <w:instrText xml:space="preserve"> PAGEREF _Toc237877543 \h </w:instrText>
+          <w:instrText xml:space="preserve"> PAGEREF _Toc238317424 \h </w:instrText>
         </w:r>
         <w:r>
           <w:rPr>
@@ -1796,7 +1840,7 @@
           <w14:ligatures w14:val="standardContextual"/>
         </w:rPr>
       </w:pPr>
-      <w:hyperlink w:anchor="_Toc237877544" w:history="1">
+      <w:hyperlink w:anchor="_Toc238317425" w:history="1">
         <w:r>
           <w:rPr>
             <w:rStyle w:val="Hyperlink"/>
@@ -1823,7 +1867,7 @@
             <w:noProof/>
             <w:webHidden/>
           </w:rPr>
-          <w:instrText xml:space="preserve"> PAGEREF _Toc237877544 \h </w:instrText>
+          <w:instrText xml:space="preserve"> PAGEREF _Toc238317425 \h </w:instrText>
         </w:r>
         <w:r>
           <w:rPr>
@@ -1843,7 +1887,7 @@
             <w:noProof/>
             <w:webHidden/>
           </w:rPr>
-          <w:t>16</w:t>
+          <w:t>17</w:t>
         </w:r>
         <w:r>
           <w:rPr>
@@ -1871,7 +1915,7 @@
           <w14:ligatures w14:val="standardContextual"/>
         </w:rPr>
       </w:pPr>
-      <w:hyperlink w:anchor="_Toc237877545" w:history="1">
+      <w:hyperlink w:anchor="_Toc238317426" w:history="1">
         <w:r>
           <w:rPr>
             <w:rStyle w:val="Hyperlink"/>
@@ -1898,7 +1942,7 @@
             <w:noProof/>
             <w:webHidden/>
           </w:rPr>
-          <w:instrText xml:space="preserve"> PAGEREF _Toc237877545 \h </w:instrText>
+          <w:instrText xml:space="preserve"> PAGEREF _Toc238317426 \h </w:instrText>
         </w:r>
         <w:r>
           <w:rPr>
@@ -1918,7 +1962,7 @@
             <w:noProof/>
             <w:webHidden/>
           </w:rPr>
-          <w:t>16</w:t>
+          <w:t>19</w:t>
         </w:r>
         <w:r>
           <w:rPr>
@@ -1946,7 +1990,7 @@
           <w14:ligatures w14:val="standardContextual"/>
         </w:rPr>
       </w:pPr>
-      <w:hyperlink w:anchor="_Toc237877546" w:history="1">
+      <w:hyperlink w:anchor="_Toc238317427" w:history="1">
         <w:r>
           <w:rPr>
             <w:rStyle w:val="Hyperlink"/>
@@ -1973,7 +2017,7 @@
             <w:noProof/>
             <w:webHidden/>
           </w:rPr>
-          <w:instrText xml:space="preserve"> PAGEREF _Toc237877546 \h </w:instrText>
+          <w:instrText xml:space="preserve"> PAGEREF _Toc238317427 \h </w:instrText>
         </w:r>
         <w:r>
           <w:rPr>
@@ -1993,7 +2037,7 @@
             <w:noProof/>
             <w:webHidden/>
           </w:rPr>
-          <w:t>17</w:t>
+          <w:t>22</w:t>
         </w:r>
         <w:r>
           <w:rPr>
@@ -2021,7 +2065,7 @@
           <w14:ligatures w14:val="standardContextual"/>
         </w:rPr>
       </w:pPr>
-      <w:hyperlink w:anchor="_Toc237877547" w:history="1">
+      <w:hyperlink w:anchor="_Toc238317428" w:history="1">
         <w:r>
           <w:rPr>
             <w:rStyle w:val="Hyperlink"/>
@@ -2048,7 +2092,7 @@
             <w:noProof/>
             <w:webHidden/>
           </w:rPr>
-          <w:instrText xml:space="preserve"> PAGEREF _Toc237877547 \h </w:instrText>
+          <w:instrText xml:space="preserve"> PAGEREF _Toc238317428 \h </w:instrText>
         </w:r>
         <w:r>
           <w:rPr>
@@ -2068,7 +2112,7 @@
             <w:noProof/>
             <w:webHidden/>
           </w:rPr>
-          <w:t>17</w:t>
+          <w:t>22</w:t>
         </w:r>
         <w:r>
           <w:rPr>
@@ -2096,7 +2140,7 @@
           <w14:ligatures w14:val="standardContextual"/>
         </w:rPr>
       </w:pPr>
-      <w:hyperlink w:anchor="_Toc237877548" w:history="1">
+      <w:hyperlink w:anchor="_Toc238317429" w:history="1">
         <w:r>
           <w:rPr>
             <w:rStyle w:val="Hyperlink"/>
@@ -2123,7 +2167,7 @@
             <w:noProof/>
             <w:webHidden/>
           </w:rPr>
-          <w:instrText xml:space="preserve"> PAGEREF _Toc237877548 \h </w:instrText>
+          <w:instrText xml:space="preserve"> PAGEREF _Toc238317429 \h </w:instrText>
         </w:r>
         <w:r>
           <w:rPr>
@@ -2143,7 +2187,7 @@
             <w:noProof/>
             <w:webHidden/>
           </w:rPr>
-          <w:t>19</w:t>
+          <w:t>25</w:t>
         </w:r>
         <w:r>
           <w:rPr>
@@ -2171,7 +2215,7 @@
           <w14:ligatures w14:val="standardContextual"/>
         </w:rPr>
       </w:pPr>
-      <w:hyperlink w:anchor="_Toc237877549" w:history="1">
+      <w:hyperlink w:anchor="_Toc238317430" w:history="1">
         <w:r>
           <w:rPr>
             <w:rStyle w:val="Hyperlink"/>
@@ -2198,7 +2242,7 @@
             <w:noProof/>
             <w:webHidden/>
           </w:rPr>
-          <w:instrText xml:space="preserve"> PAGEREF _Toc237877549 \h </w:instrText>
+          <w:instrText xml:space="preserve"> PAGEREF _Toc238317430 \h </w:instrText>
         </w:r>
         <w:r>
           <w:rPr>
@@ -2218,7 +2262,7 @@
             <w:noProof/>
             <w:webHidden/>
           </w:rPr>
-          <w:t>20</w:t>
+          <w:t>26</w:t>
         </w:r>
         <w:r>
           <w:rPr>
@@ -2246,27 +2290,13 @@
           <w14:ligatures w14:val="standardContextual"/>
         </w:rPr>
       </w:pPr>
-      <w:hyperlink w:anchor="_Toc237877550" w:history="1">
+      <w:hyperlink w:anchor="_Toc238317431" w:history="1">
         <w:r>
           <w:rPr>
             <w:rStyle w:val="Hyperlink"/>
             <w:noProof/>
           </w:rPr>
-          <w:t xml:space="preserve">3. Part II </w:t>
-        </w:r>
-        <w:r>
-          <w:rPr>
-            <w:rStyle w:val="Hyperlink"/>
-            <w:noProof/>
-          </w:rPr>
-          <w:t>-</w:t>
-        </w:r>
-        <w:r>
-          <w:rPr>
-            <w:rStyle w:val="Hyperlink"/>
-            <w:noProof/>
-          </w:rPr>
-          <w:t xml:space="preserve"> Sarcasm Detection: A Six-Method Comparison</w:t>
+          <w:t>3. Part II - Sarcasm Detection: A Six-Method Comparison</w:t>
         </w:r>
         <w:r>
           <w:rPr>
@@ -2287,7 +2317,7 @@
             <w:noProof/>
             <w:webHidden/>
           </w:rPr>
-          <w:instrText xml:space="preserve"> PAGEREF _Toc237877550 \h </w:instrText>
+          <w:instrText xml:space="preserve"> PAGEREF _Toc238317431 \h </w:instrText>
         </w:r>
         <w:r>
           <w:rPr>
@@ -2307,7 +2337,7 @@
             <w:noProof/>
             <w:webHidden/>
           </w:rPr>
-          <w:t>21</w:t>
+          <w:t>28</w:t>
         </w:r>
         <w:r>
           <w:rPr>
@@ -2335,7 +2365,7 @@
           <w14:ligatures w14:val="standardContextual"/>
         </w:rPr>
       </w:pPr>
-      <w:hyperlink w:anchor="_Toc237877551" w:history="1">
+      <w:hyperlink w:anchor="_Toc238317432" w:history="1">
         <w:r>
           <w:rPr>
             <w:rStyle w:val="Hyperlink"/>
@@ -2362,7 +2392,7 @@
             <w:noProof/>
             <w:webHidden/>
           </w:rPr>
-          <w:instrText xml:space="preserve"> PAGEREF _Toc237877551 \h </w:instrText>
+          <w:instrText xml:space="preserve"> PAGEREF _Toc238317432 \h </w:instrText>
         </w:r>
         <w:r>
           <w:rPr>
@@ -2382,7 +2412,7 @@
             <w:noProof/>
             <w:webHidden/>
           </w:rPr>
-          <w:t>21</w:t>
+          <w:t>28</w:t>
         </w:r>
         <w:r>
           <w:rPr>
@@ -2410,7 +2440,7 @@
           <w14:ligatures w14:val="standardContextual"/>
         </w:rPr>
       </w:pPr>
-      <w:hyperlink w:anchor="_Toc237877552" w:history="1">
+      <w:hyperlink w:anchor="_Toc238317433" w:history="1">
         <w:r>
           <w:rPr>
             <w:rStyle w:val="Hyperlink"/>
@@ -2437,7 +2467,7 @@
             <w:noProof/>
             <w:webHidden/>
           </w:rPr>
-          <w:instrText xml:space="preserve"> PAGEREF _Toc237877552 \h </w:instrText>
+          <w:instrText xml:space="preserve"> PAGEREF _Toc238317433 \h </w:instrText>
         </w:r>
         <w:r>
           <w:rPr>
@@ -2457,7 +2487,7 @@
             <w:noProof/>
             <w:webHidden/>
           </w:rPr>
-          <w:t>21</w:t>
+          <w:t>28</w:t>
         </w:r>
         <w:r>
           <w:rPr>
@@ -2485,7 +2515,7 @@
           <w14:ligatures w14:val="standardContextual"/>
         </w:rPr>
       </w:pPr>
-      <w:hyperlink w:anchor="_Toc237877553" w:history="1">
+      <w:hyperlink w:anchor="_Toc238317434" w:history="1">
         <w:r>
           <w:rPr>
             <w:rStyle w:val="Hyperlink"/>
@@ -2512,7 +2542,7 @@
             <w:noProof/>
             <w:webHidden/>
           </w:rPr>
-          <w:instrText xml:space="preserve"> PAGEREF _Toc237877553 \h </w:instrText>
+          <w:instrText xml:space="preserve"> PAGEREF _Toc238317434 \h </w:instrText>
         </w:r>
         <w:r>
           <w:rPr>
@@ -2532,7 +2562,7 @@
             <w:noProof/>
             <w:webHidden/>
           </w:rPr>
-          <w:t>23</w:t>
+          <w:t>30</w:t>
         </w:r>
         <w:r>
           <w:rPr>
@@ -2560,7 +2590,7 @@
           <w14:ligatures w14:val="standardContextual"/>
         </w:rPr>
       </w:pPr>
-      <w:hyperlink w:anchor="_Toc237877554" w:history="1">
+      <w:hyperlink w:anchor="_Toc238317435" w:history="1">
         <w:r>
           <w:rPr>
             <w:rStyle w:val="Hyperlink"/>
@@ -2587,7 +2617,7 @@
             <w:noProof/>
             <w:webHidden/>
           </w:rPr>
-          <w:instrText xml:space="preserve"> PAGEREF _Toc237877554 \h </w:instrText>
+          <w:instrText xml:space="preserve"> PAGEREF _Toc238317435 \h </w:instrText>
         </w:r>
         <w:r>
           <w:rPr>
@@ -2607,7 +2637,7 @@
             <w:noProof/>
             <w:webHidden/>
           </w:rPr>
-          <w:t>24</w:t>
+          <w:t>32</w:t>
         </w:r>
         <w:r>
           <w:rPr>
@@ -2635,7 +2665,7 @@
           <w14:ligatures w14:val="standardContextual"/>
         </w:rPr>
       </w:pPr>
-      <w:hyperlink w:anchor="_Toc237877555" w:history="1">
+      <w:hyperlink w:anchor="_Toc238317436" w:history="1">
         <w:r>
           <w:rPr>
             <w:rStyle w:val="Hyperlink"/>
@@ -2662,7 +2692,7 @@
             <w:noProof/>
             <w:webHidden/>
           </w:rPr>
-          <w:instrText xml:space="preserve"> PAGEREF _Toc237877555 \h </w:instrText>
+          <w:instrText xml:space="preserve"> PAGEREF _Toc238317436 \h </w:instrText>
         </w:r>
         <w:r>
           <w:rPr>
@@ -2682,7 +2712,7 @@
             <w:noProof/>
             <w:webHidden/>
           </w:rPr>
-          <w:t>24</w:t>
+          <w:t>32</w:t>
         </w:r>
         <w:r>
           <w:rPr>
@@ -2710,7 +2740,7 @@
           <w14:ligatures w14:val="standardContextual"/>
         </w:rPr>
       </w:pPr>
-      <w:hyperlink w:anchor="_Toc237877556" w:history="1">
+      <w:hyperlink w:anchor="_Toc238317437" w:history="1">
         <w:r>
           <w:rPr>
             <w:rStyle w:val="Hyperlink"/>
@@ -2737,7 +2767,7 @@
             <w:noProof/>
             <w:webHidden/>
           </w:rPr>
-          <w:instrText xml:space="preserve"> PAGEREF _Toc237877556 \h </w:instrText>
+          <w:instrText xml:space="preserve"> PAGEREF _Toc238317437 \h </w:instrText>
         </w:r>
         <w:r>
           <w:rPr>
@@ -2757,7 +2787,7 @@
             <w:noProof/>
             <w:webHidden/>
           </w:rPr>
-          <w:t>25</w:t>
+          <w:t>33</w:t>
         </w:r>
         <w:r>
           <w:rPr>
@@ -2785,7 +2815,7 @@
           <w14:ligatures w14:val="standardContextual"/>
         </w:rPr>
       </w:pPr>
-      <w:hyperlink w:anchor="_Toc237877557" w:history="1">
+      <w:hyperlink w:anchor="_Toc238317438" w:history="1">
         <w:r>
           <w:rPr>
             <w:rStyle w:val="Hyperlink"/>
@@ -2812,7 +2842,7 @@
             <w:noProof/>
             <w:webHidden/>
           </w:rPr>
-          <w:instrText xml:space="preserve"> PAGEREF _Toc237877557 \h </w:instrText>
+          <w:instrText xml:space="preserve"> PAGEREF _Toc238317438 \h </w:instrText>
         </w:r>
         <w:r>
           <w:rPr>
@@ -2832,7 +2862,7 @@
             <w:noProof/>
             <w:webHidden/>
           </w:rPr>
-          <w:t>26</w:t>
+          <w:t>33</w:t>
         </w:r>
         <w:r>
           <w:rPr>
@@ -2860,7 +2890,7 @@
           <w14:ligatures w14:val="standardContextual"/>
         </w:rPr>
       </w:pPr>
-      <w:hyperlink w:anchor="_Toc237877558" w:history="1">
+      <w:hyperlink w:anchor="_Toc238317439" w:history="1">
         <w:r>
           <w:rPr>
             <w:rStyle w:val="Hyperlink"/>
@@ -2887,7 +2917,7 @@
             <w:noProof/>
             <w:webHidden/>
           </w:rPr>
-          <w:instrText xml:space="preserve"> PAGEREF _Toc237877558 \h </w:instrText>
+          <w:instrText xml:space="preserve"> PAGEREF _Toc238317439 \h </w:instrText>
         </w:r>
         <w:r>
           <w:rPr>
@@ -2907,7 +2937,7 @@
             <w:noProof/>
             <w:webHidden/>
           </w:rPr>
-          <w:t>29</w:t>
+          <w:t>37</w:t>
         </w:r>
         <w:r>
           <w:rPr>
@@ -2935,7 +2965,7 @@
           <w14:ligatures w14:val="standardContextual"/>
         </w:rPr>
       </w:pPr>
-      <w:hyperlink w:anchor="_Toc237877559" w:history="1">
+      <w:hyperlink w:anchor="_Toc238317440" w:history="1">
         <w:r>
           <w:rPr>
             <w:rStyle w:val="Hyperlink"/>
@@ -2962,7 +2992,7 @@
             <w:noProof/>
             <w:webHidden/>
           </w:rPr>
-          <w:instrText xml:space="preserve"> PAGEREF _Toc237877559 \h </w:instrText>
+          <w:instrText xml:space="preserve"> PAGEREF _Toc238317440 \h </w:instrText>
         </w:r>
         <w:r>
           <w:rPr>
@@ -2982,7 +3012,7 @@
             <w:noProof/>
             <w:webHidden/>
           </w:rPr>
-          <w:t>31</w:t>
+          <w:t>40</w:t>
         </w:r>
         <w:r>
           <w:rPr>
@@ -3010,7 +3040,7 @@
           <w14:ligatures w14:val="standardContextual"/>
         </w:rPr>
       </w:pPr>
-      <w:hyperlink w:anchor="_Toc237877560" w:history="1">
+      <w:hyperlink w:anchor="_Toc238317441" w:history="1">
         <w:r>
           <w:rPr>
             <w:rStyle w:val="Hyperlink"/>
@@ -3037,7 +3067,7 @@
             <w:noProof/>
             <w:webHidden/>
           </w:rPr>
-          <w:instrText xml:space="preserve"> PAGEREF _Toc237877560 \h </w:instrText>
+          <w:instrText xml:space="preserve"> PAGEREF _Toc238317441 \h </w:instrText>
         </w:r>
         <w:r>
           <w:rPr>
@@ -3057,7 +3087,7 @@
             <w:noProof/>
             <w:webHidden/>
           </w:rPr>
-          <w:t>33</w:t>
+          <w:t>42</w:t>
         </w:r>
         <w:r>
           <w:rPr>
@@ -3085,7 +3115,7 @@
           <w14:ligatures w14:val="standardContextual"/>
         </w:rPr>
       </w:pPr>
-      <w:hyperlink w:anchor="_Toc237877561" w:history="1">
+      <w:hyperlink w:anchor="_Toc238317442" w:history="1">
         <w:r>
           <w:rPr>
             <w:rStyle w:val="Hyperlink"/>
@@ -3112,7 +3142,7 @@
             <w:noProof/>
             <w:webHidden/>
           </w:rPr>
-          <w:instrText xml:space="preserve"> PAGEREF _Toc237877561 \h </w:instrText>
+          <w:instrText xml:space="preserve"> PAGEREF _Toc238317442 \h </w:instrText>
         </w:r>
         <w:r>
           <w:rPr>
@@ -3132,7 +3162,7 @@
             <w:noProof/>
             <w:webHidden/>
           </w:rPr>
-          <w:t>34</w:t>
+          <w:t>45</w:t>
         </w:r>
         <w:r>
           <w:rPr>
@@ -3160,7 +3190,7 @@
           <w14:ligatures w14:val="standardContextual"/>
         </w:rPr>
       </w:pPr>
-      <w:hyperlink w:anchor="_Toc237877562" w:history="1">
+      <w:hyperlink w:anchor="_Toc238317443" w:history="1">
         <w:r>
           <w:rPr>
             <w:rStyle w:val="Hyperlink"/>
@@ -3187,7 +3217,7 @@
             <w:noProof/>
             <w:webHidden/>
           </w:rPr>
-          <w:instrText xml:space="preserve"> PAGEREF _Toc237877562 \h </w:instrText>
+          <w:instrText xml:space="preserve"> PAGEREF _Toc238317443 \h </w:instrText>
         </w:r>
         <w:r>
           <w:rPr>
@@ -3207,7 +3237,7 @@
             <w:noProof/>
             <w:webHidden/>
           </w:rPr>
-          <w:t>35</w:t>
+          <w:t>46</w:t>
         </w:r>
         <w:r>
           <w:rPr>
@@ -3235,7 +3265,7 @@
           <w14:ligatures w14:val="standardContextual"/>
         </w:rPr>
       </w:pPr>
-      <w:hyperlink w:anchor="_Toc237877563" w:history="1">
+      <w:hyperlink w:anchor="_Toc238317444" w:history="1">
         <w:r>
           <w:rPr>
             <w:rStyle w:val="Hyperlink"/>
@@ -3262,7 +3292,7 @@
             <w:noProof/>
             <w:webHidden/>
           </w:rPr>
-          <w:instrText xml:space="preserve"> PAGEREF _Toc237877563 \h </w:instrText>
+          <w:instrText xml:space="preserve"> PAGEREF _Toc238317444 \h </w:instrText>
         </w:r>
         <w:r>
           <w:rPr>
@@ -3282,7 +3312,7 @@
             <w:noProof/>
             <w:webHidden/>
           </w:rPr>
-          <w:t>36</w:t>
+          <w:t>47</w:t>
         </w:r>
         <w:r>
           <w:rPr>
@@ -3310,7 +3340,7 @@
           <w14:ligatures w14:val="standardContextual"/>
         </w:rPr>
       </w:pPr>
-      <w:hyperlink w:anchor="_Toc237877564" w:history="1">
+      <w:hyperlink w:anchor="_Toc238317445" w:history="1">
         <w:r>
           <w:rPr>
             <w:rStyle w:val="Hyperlink"/>
@@ -3337,7 +3367,7 @@
             <w:noProof/>
             <w:webHidden/>
           </w:rPr>
-          <w:instrText xml:space="preserve"> PAGEREF _Toc237877564 \h </w:instrText>
+          <w:instrText xml:space="preserve"> PAGEREF _Toc238317445 \h </w:instrText>
         </w:r>
         <w:r>
           <w:rPr>
@@ -3357,7 +3387,7 @@
             <w:noProof/>
             <w:webHidden/>
           </w:rPr>
-          <w:t>37</w:t>
+          <w:t>48</w:t>
         </w:r>
         <w:r>
           <w:rPr>
@@ -3385,7 +3415,7 @@
           <w14:ligatures w14:val="standardContextual"/>
         </w:rPr>
       </w:pPr>
-      <w:hyperlink w:anchor="_Toc237877565" w:history="1">
+      <w:hyperlink w:anchor="_Toc238317446" w:history="1">
         <w:r>
           <w:rPr>
             <w:rStyle w:val="Hyperlink"/>
@@ -3412,7 +3442,7 @@
             <w:noProof/>
             <w:webHidden/>
           </w:rPr>
-          <w:instrText xml:space="preserve"> PAGEREF _Toc237877565 \h </w:instrText>
+          <w:instrText xml:space="preserve"> PAGEREF _Toc238317446 \h </w:instrText>
         </w:r>
         <w:r>
           <w:rPr>
@@ -3432,7 +3462,7 @@
             <w:noProof/>
             <w:webHidden/>
           </w:rPr>
-          <w:t>38</w:t>
+          <w:t>49</w:t>
         </w:r>
         <w:r>
           <w:rPr>
@@ -3460,27 +3490,13 @@
           <w14:ligatures w14:val="standardContextual"/>
         </w:rPr>
       </w:pPr>
-      <w:hyperlink w:anchor="_Toc237877550" w:history="1">
+      <w:hyperlink w:anchor="_Toc238317447" w:history="1">
         <w:r>
           <w:rPr>
             <w:rStyle w:val="Hyperlink"/>
             <w:noProof/>
           </w:rPr>
-          <w:t xml:space="preserve">4. Part III - SIGN Generalization</w:t>
-        </w:r>
-        <w:r>
-          <w:rPr>
-            <w:rStyle w:val="Hyperlink"/>
-            <w:noProof/>
-          </w:rPr>
-          <w:t/>
-        </w:r>
-        <w:r>
-          <w:rPr>
-            <w:rStyle w:val="Hyperlink"/>
-            <w:noProof/>
-          </w:rPr>
-          <w:t xml:space="preserve"/>
+          <w:t>4. Part III - SIGN Generalization</w:t>
         </w:r>
         <w:r>
           <w:rPr>
@@ -3501,7 +3517,7 @@
             <w:noProof/>
             <w:webHidden/>
           </w:rPr>
-          <w:instrText xml:space="preserve"> PAGEREF _Toc237877550 \h </w:instrText>
+          <w:instrText xml:space="preserve"> PAGEREF _Toc238317447 \h </w:instrText>
         </w:r>
         <w:r>
           <w:rPr>
@@ -3521,7 +3537,7 @@
             <w:noProof/>
             <w:webHidden/>
           </w:rPr>
-          <w:t>39</w:t>
+          <w:t>50</w:t>
         </w:r>
         <w:r>
           <w:rPr>
@@ -3549,7 +3565,7 @@
           <w14:ligatures w14:val="standardContextual"/>
         </w:rPr>
       </w:pPr>
-      <w:hyperlink w:anchor="_Toc237877551" w:history="1">
+      <w:hyperlink w:anchor="_Toc238317448" w:history="1">
         <w:r>
           <w:rPr>
             <w:rStyle w:val="Hyperlink"/>
@@ -3576,7 +3592,7 @@
             <w:noProof/>
             <w:webHidden/>
           </w:rPr>
-          <w:instrText xml:space="preserve"> PAGEREF _Toc237877551 \h </w:instrText>
+          <w:instrText xml:space="preserve"> PAGEREF _Toc238317448 \h </w:instrText>
         </w:r>
         <w:r>
           <w:rPr>
@@ -3596,7 +3612,7 @@
             <w:noProof/>
             <w:webHidden/>
           </w:rPr>
-          <w:t>39</w:t>
+          <w:t>50</w:t>
         </w:r>
         <w:r>
           <w:rPr>
@@ -3624,7 +3640,7 @@
           <w14:ligatures w14:val="standardContextual"/>
         </w:rPr>
       </w:pPr>
-      <w:hyperlink w:anchor="_Toc237877551" w:history="1">
+      <w:hyperlink w:anchor="_Toc238317449" w:history="1">
         <w:r>
           <w:rPr>
             <w:rStyle w:val="Hyperlink"/>
@@ -3651,7 +3667,7 @@
             <w:noProof/>
             <w:webHidden/>
           </w:rPr>
-          <w:instrText xml:space="preserve"> PAGEREF _Toc237877551 \h </w:instrText>
+          <w:instrText xml:space="preserve"> PAGEREF _Toc238317449 \h </w:instrText>
         </w:r>
         <w:r>
           <w:rPr>
@@ -3671,7 +3687,7 @@
             <w:noProof/>
             <w:webHidden/>
           </w:rPr>
-          <w:t>40</w:t>
+          <w:t>51</w:t>
         </w:r>
         <w:r>
           <w:rPr>
@@ -3699,7 +3715,7 @@
           <w14:ligatures w14:val="standardContextual"/>
         </w:rPr>
       </w:pPr>
-      <w:hyperlink w:anchor="_Toc237877551" w:history="1">
+      <w:hyperlink w:anchor="_Toc238317450" w:history="1">
         <w:r>
           <w:rPr>
             <w:rStyle w:val="Hyperlink"/>
@@ -3726,7 +3742,7 @@
             <w:noProof/>
             <w:webHidden/>
           </w:rPr>
-          <w:instrText xml:space="preserve"> PAGEREF _Toc237877551 \h </w:instrText>
+          <w:instrText xml:space="preserve"> PAGEREF _Toc238317450 \h </w:instrText>
         </w:r>
         <w:r>
           <w:rPr>
@@ -3746,7 +3762,7 @@
             <w:noProof/>
             <w:webHidden/>
           </w:rPr>
-          <w:t>40</w:t>
+          <w:t>52</w:t>
         </w:r>
         <w:r>
           <w:rPr>
@@ -3774,7 +3790,7 @@
           <w14:ligatures w14:val="standardContextual"/>
         </w:rPr>
       </w:pPr>
-      <w:hyperlink w:anchor="_Toc237877551" w:history="1">
+      <w:hyperlink w:anchor="_Toc238317451" w:history="1">
         <w:r>
           <w:rPr>
             <w:rStyle w:val="Hyperlink"/>
@@ -3801,7 +3817,7 @@
             <w:noProof/>
             <w:webHidden/>
           </w:rPr>
-          <w:instrText xml:space="preserve"> PAGEREF _Toc237877551 \h </w:instrText>
+          <w:instrText xml:space="preserve"> PAGEREF _Toc238317451 \h </w:instrText>
         </w:r>
         <w:r>
           <w:rPr>
@@ -3821,7 +3837,7 @@
             <w:noProof/>
             <w:webHidden/>
           </w:rPr>
-          <w:t>41</w:t>
+          <w:t>52</w:t>
         </w:r>
         <w:r>
           <w:rPr>
@@ -3849,7 +3865,7 @@
           <w14:ligatures w14:val="standardContextual"/>
         </w:rPr>
       </w:pPr>
-      <w:hyperlink w:anchor="_Toc237877551" w:history="1">
+      <w:hyperlink w:anchor="_Toc238317452" w:history="1">
         <w:r>
           <w:rPr>
             <w:rStyle w:val="Hyperlink"/>
@@ -3876,7 +3892,7 @@
             <w:noProof/>
             <w:webHidden/>
           </w:rPr>
-          <w:instrText xml:space="preserve"> PAGEREF _Toc237877551 \h </w:instrText>
+          <w:instrText xml:space="preserve"> PAGEREF _Toc238317452 \h </w:instrText>
         </w:r>
         <w:r>
           <w:rPr>
@@ -3896,7 +3912,7 @@
             <w:noProof/>
             <w:webHidden/>
           </w:rPr>
-          <w:t>41</w:t>
+          <w:t>53</w:t>
         </w:r>
         <w:r>
           <w:rPr>
@@ -3924,7 +3940,7 @@
           <w14:ligatures w14:val="standardContextual"/>
         </w:rPr>
       </w:pPr>
-      <w:hyperlink w:anchor="_Toc237877551" w:history="1">
+      <w:hyperlink w:anchor="_Toc238317453" w:history="1">
         <w:r>
           <w:rPr>
             <w:rStyle w:val="Hyperlink"/>
@@ -3951,7 +3967,7 @@
             <w:noProof/>
             <w:webHidden/>
           </w:rPr>
-          <w:instrText xml:space="preserve"> PAGEREF _Toc237877551 \h </w:instrText>
+          <w:instrText xml:space="preserve"> PAGEREF _Toc238317453 \h </w:instrText>
         </w:r>
         <w:r>
           <w:rPr>
@@ -3971,7 +3987,7 @@
             <w:noProof/>
             <w:webHidden/>
           </w:rPr>
-          <w:t>42</w:t>
+          <w:t>53</w:t>
         </w:r>
         <w:r>
           <w:rPr>
@@ -3999,7 +4015,7 @@
           <w14:ligatures w14:val="standardContextual"/>
         </w:rPr>
       </w:pPr>
-      <w:hyperlink w:anchor="_Toc237877551" w:history="1">
+      <w:hyperlink w:anchor="_Toc238317454" w:history="1">
         <w:r>
           <w:rPr>
             <w:rStyle w:val="Hyperlink"/>
@@ -4026,7 +4042,7 @@
             <w:noProof/>
             <w:webHidden/>
           </w:rPr>
-          <w:instrText xml:space="preserve"> PAGEREF _Toc237877551 \h </w:instrText>
+          <w:instrText xml:space="preserve"> PAGEREF _Toc238317454 \h </w:instrText>
         </w:r>
         <w:r>
           <w:rPr>
@@ -4046,7 +4062,7 @@
             <w:noProof/>
             <w:webHidden/>
           </w:rPr>
-          <w:t>42</w:t>
+          <w:t>54</w:t>
         </w:r>
         <w:r>
           <w:rPr>
@@ -4074,7 +4090,7 @@
           <w14:ligatures w14:val="standardContextual"/>
         </w:rPr>
       </w:pPr>
-      <w:hyperlink w:anchor="_Toc237877551" w:history="1">
+      <w:hyperlink w:anchor="_Toc238317455" w:history="1">
         <w:r>
           <w:rPr>
             <w:rStyle w:val="Hyperlink"/>
@@ -4101,7 +4117,7 @@
             <w:noProof/>
             <w:webHidden/>
           </w:rPr>
-          <w:instrText xml:space="preserve"> PAGEREF _Toc237877551 \h </w:instrText>
+          <w:instrText xml:space="preserve"> PAGEREF _Toc238317455 \h </w:instrText>
         </w:r>
         <w:r>
           <w:rPr>
@@ -4121,7 +4137,7 @@
             <w:noProof/>
             <w:webHidden/>
           </w:rPr>
-          <w:t>43</w:t>
+          <w:t>54</w:t>
         </w:r>
         <w:r>
           <w:rPr>
@@ -4149,7 +4165,7 @@
           <w14:ligatures w14:val="standardContextual"/>
         </w:rPr>
       </w:pPr>
-      <w:hyperlink w:anchor="_Toc237877551" w:history="1">
+      <w:hyperlink w:anchor="_Toc238317456" w:history="1">
         <w:r>
           <w:rPr>
             <w:rStyle w:val="Hyperlink"/>
@@ -4176,7 +4192,7 @@
             <w:noProof/>
             <w:webHidden/>
           </w:rPr>
-          <w:instrText xml:space="preserve"> PAGEREF _Toc237877551 \h </w:instrText>
+          <w:instrText xml:space="preserve"> PAGEREF _Toc238317456 \h </w:instrText>
         </w:r>
         <w:r>
           <w:rPr>
@@ -4196,7 +4212,7 @@
             <w:noProof/>
             <w:webHidden/>
           </w:rPr>
-          <w:t>43</w:t>
+          <w:t>55</w:t>
         </w:r>
         <w:r>
           <w:rPr>
@@ -4224,7 +4240,7 @@
           <w14:ligatures w14:val="standardContextual"/>
         </w:rPr>
       </w:pPr>
-      <w:hyperlink w:anchor="_Toc237877551" w:history="1">
+      <w:hyperlink w:anchor="_Toc238317457" w:history="1">
         <w:r>
           <w:rPr>
             <w:rStyle w:val="Hyperlink"/>
@@ -4251,7 +4267,7 @@
             <w:noProof/>
             <w:webHidden/>
           </w:rPr>
-          <w:instrText xml:space="preserve"> PAGEREF _Toc237877551 \h </w:instrText>
+          <w:instrText xml:space="preserve"> PAGEREF _Toc238317457 \h </w:instrText>
         </w:r>
         <w:r>
           <w:rPr>
@@ -4271,7 +4287,7 @@
             <w:noProof/>
             <w:webHidden/>
           </w:rPr>
-          <w:t>44</w:t>
+          <w:t>56</w:t>
         </w:r>
         <w:r>
           <w:rPr>
@@ -4299,7 +4315,7 @@
           <w14:ligatures w14:val="standardContextual"/>
         </w:rPr>
       </w:pPr>
-      <w:hyperlink w:anchor="_Toc237877551" w:history="1">
+      <w:hyperlink w:anchor="_Toc238317458" w:history="1">
         <w:r>
           <w:rPr>
             <w:rStyle w:val="Hyperlink"/>
@@ -4326,7 +4342,7 @@
             <w:noProof/>
             <w:webHidden/>
           </w:rPr>
-          <w:instrText xml:space="preserve"> PAGEREF _Toc237877551 \h </w:instrText>
+          <w:instrText xml:space="preserve"> PAGEREF _Toc238317458 \h </w:instrText>
         </w:r>
         <w:r>
           <w:rPr>
@@ -4346,7 +4362,7 @@
             <w:noProof/>
             <w:webHidden/>
           </w:rPr>
-          <w:t>44</w:t>
+          <w:t>56</w:t>
         </w:r>
         <w:r>
           <w:rPr>
@@ -4374,7 +4390,7 @@
           <w14:ligatures w14:val="standardContextual"/>
         </w:rPr>
       </w:pPr>
-      <w:hyperlink w:anchor="_Toc237877566" w:history="1">
+      <w:hyperlink w:anchor="_Toc238317459" w:history="1">
         <w:r>
           <w:rPr>
             <w:rStyle w:val="Hyperlink"/>
@@ -4401,7 +4417,7 @@
             <w:noProof/>
             <w:webHidden/>
           </w:rPr>
-          <w:instrText xml:space="preserve"> PAGEREF _Toc237877566 \h </w:instrText>
+          <w:instrText xml:space="preserve"> PAGEREF _Toc238317459 \h </w:instrText>
         </w:r>
         <w:r>
           <w:rPr>
@@ -4421,7 +4437,7 @@
             <w:noProof/>
             <w:webHidden/>
           </w:rPr>
-          <w:t>39</w:t>
+          <w:t>57</w:t>
         </w:r>
         <w:r>
           <w:rPr>
@@ -4449,13 +4465,13 @@
           <w14:ligatures w14:val="standardContextual"/>
         </w:rPr>
       </w:pPr>
-      <w:hyperlink w:anchor="_Toc237877567" w:history="1">
+      <w:hyperlink w:anchor="_Toc238317460" w:history="1">
         <w:r>
           <w:rPr>
             <w:rStyle w:val="Hyperlink"/>
             <w:noProof/>
           </w:rPr>
-          <w:t>6. Reproducibility</w:t>
+          <w:t>6. References</w:t>
         </w:r>
         <w:r>
           <w:rPr>
@@ -4476,7 +4492,7 @@
             <w:noProof/>
             <w:webHidden/>
           </w:rPr>
-          <w:instrText xml:space="preserve"> PAGEREF _Toc237877567 \h </w:instrText>
+          <w:instrText xml:space="preserve"> PAGEREF _Toc238317460 \h </w:instrText>
         </w:r>
         <w:r>
           <w:rPr>
@@ -4496,7 +4512,7 @@
             <w:noProof/>
             <w:webHidden/>
           </w:rPr>
-          <w:t>41</w:t>
+          <w:t>59</w:t>
         </w:r>
         <w:r>
           <w:rPr>
@@ -4509,93 +4525,10 @@
     </w:p>
     <w:p>
       <w:pPr>
-        <w:pStyle w:val="TOC1"/>
-        <w:tabs>
-          <w:tab w:val="right" w:leader="dot" w:pos="9508"/>
-        </w:tabs>
-        <w:rPr>
-          <w:rFonts w:asciiTheme="minorHAnsi" w:eastAsiaTheme="minorEastAsia" w:hAnsiTheme="minorHAnsi"/>
-          <w:noProof/>
-          <w:color w:val="auto"/>
-          <w:kern w:val="2"/>
-          <w:sz w:val="24"/>
-          <w:szCs w:val="24"/>
-          <w:lang w:val="en-IL" w:bidi="he-IL"/>
-          <w14:ligatures w14:val="standardContextual"/>
-        </w:rPr>
-      </w:pPr>
-      <w:hyperlink w:anchor="_Toc237877568" w:history="1">
-        <w:r>
-          <w:rPr>
-            <w:rStyle w:val="Hyperlink"/>
-            <w:noProof/>
-          </w:rPr>
-          <w:t>7. References</w:t>
-        </w:r>
-        <w:r>
-          <w:rPr>
-            <w:noProof/>
-            <w:webHidden/>
-          </w:rPr>
-          <w:tab/>
-        </w:r>
-        <w:r>
-          <w:rPr>
-            <w:noProof/>
-            <w:webHidden/>
-          </w:rPr>
-          <w:fldChar w:fldCharType="begin"/>
-        </w:r>
-        <w:r>
-          <w:rPr>
-            <w:noProof/>
-            <w:webHidden/>
-          </w:rPr>
-          <w:instrText xml:space="preserve"> PAGEREF _Toc237877568 \h </w:instrText>
-        </w:r>
-        <w:r>
-          <w:rPr>
-            <w:noProof/>
-            <w:webHidden/>
-          </w:rPr>
-        </w:r>
-        <w:r>
-          <w:rPr>
-            <w:noProof/>
-            <w:webHidden/>
-          </w:rPr>
-          <w:fldChar w:fldCharType="separate"/>
-        </w:r>
-        <w:r>
-          <w:rPr>
-            <w:noProof/>
-            <w:webHidden/>
-          </w:rPr>
-          <w:t>43</w:t>
-        </w:r>
-        <w:r>
-          <w:rPr>
-            <w:noProof/>
-            <w:webHidden/>
-          </w:rPr>
-          <w:fldChar w:fldCharType="end"/>
-        </w:r>
-      </w:hyperlink>
-    </w:p>
-    <w:p>
-      <w:pPr>
         <w:spacing w:line="360" w:lineRule="auto"/>
       </w:pPr>
       <w:r>
         <w:fldChar w:fldCharType="end"/>
-      </w:r>
-    </w:p>
-    <w:p>
-      <w:pPr>
-        <w:spacing w:line="360" w:lineRule="auto"/>
-      </w:pPr>
-      <w:r>
-        <w:br w:type="page"/>
       </w:r>
     </w:p>
     <w:p>
@@ -4603,7 +4536,7 @@
         <w:pStyle w:val="Heading1"/>
         <w:spacing w:line="360" w:lineRule="auto"/>
       </w:pPr>
-      <w:bookmarkStart w:id="2" w:name="_Toc237877528"/>
+      <w:bookmarkStart w:id="2" w:name="_Toc238317409"/>
       <w:r>
         <w:lastRenderedPageBreak/>
         <w:t>1. Introduction</w:t>
@@ -4615,7 +4548,7 @@
         <w:pStyle w:val="Heading2"/>
         <w:spacing w:line="360" w:lineRule="auto"/>
       </w:pPr>
-      <w:bookmarkStart w:id="3" w:name="_Toc237877529"/>
+      <w:bookmarkStart w:id="3" w:name="_Toc238317410"/>
       <w:r>
         <w:t>1.1 Motivation and Problem Statement</w:t>
       </w:r>
@@ -4736,9 +4669,12 @@
         <w:pStyle w:val="Heading2"/>
         <w:spacing w:line="360" w:lineRule="auto"/>
       </w:pPr>
-      <w:bookmarkStart w:id="4" w:name="_Toc237877530"/>
-      <w:r>
-        <w:t>1.2 Project Structure and Two-Phase Scope</w:t>
+      <w:bookmarkStart w:id="4" w:name="_Toc238317411"/>
+      <w:r>
+        <w:t xml:space="preserve">1.2 Project Structure </w:t>
+      </w:r>
+      <w:r>
+        <w:t>and Scope</w:t>
       </w:r>
       <w:bookmarkEnd w:id="4"/>
     </w:p>
@@ -4847,6 +4783,7 @@
         <w:rPr>
           <w:rFonts w:cs="Calibri"/>
         </w:rPr>
+        <w:lastRenderedPageBreak/>
         <w:t>-</w:t>
       </w:r>
       <w:r>
@@ -4875,23 +4812,13 @@
       <w:r>
         <w:t>Both core phases, plus the additive third (Part III), are complete: every number reported in this document is the output of a real, executed run, never a projection or a placeholder. Full technical detail beyond the scope of this report - exact commands, environment configuration, and per-method debugging notes - is preserved in the project's own repository documentation, referenced throughout and summarized in Section 6 (Reproducibility).</w:t>
       </w:r>
-      <w:r/>
-      <w:r/>
-      <w:r/>
-      <w:r/>
-      <w:r>
-        <w:rPr>
-          <w:rFonts w:cs="Calibri"/>
-        </w:rPr>
-      </w:r>
-      <w:r/>
     </w:p>
     <w:p>
       <w:pPr>
         <w:pStyle w:val="Heading2"/>
         <w:spacing w:line="360" w:lineRule="auto"/>
       </w:pPr>
-      <w:bookmarkStart w:id="5" w:name="_Toc237877531"/>
+      <w:bookmarkStart w:id="5" w:name="_Toc238317412"/>
       <w:r>
         <w:t>1.3 Team and Supervision</w:t>
       </w:r>
@@ -4945,7 +4872,7 @@
         <w:pStyle w:val="Heading1"/>
         <w:spacing w:line="360" w:lineRule="auto"/>
       </w:pPr>
-      <w:bookmarkStart w:id="6" w:name="_Toc237877532"/>
+      <w:bookmarkStart w:id="6" w:name="_Toc238317413"/>
       <w:r>
         <w:lastRenderedPageBreak/>
         <w:t xml:space="preserve">2. Part I </w:t>
@@ -4963,7 +4890,7 @@
         <w:pStyle w:val="Heading2"/>
         <w:spacing w:line="360" w:lineRule="auto"/>
       </w:pPr>
-      <w:bookmarkStart w:id="7" w:name="_Toc237877533"/>
+      <w:bookmarkStart w:id="7" w:name="_Toc238317414"/>
       <w:r>
         <w:t>2.1 Problem Definition and Approach</w:t>
       </w:r>
@@ -5032,7 +4959,7 @@
         <w:pStyle w:val="Heading2"/>
         <w:spacing w:line="360" w:lineRule="auto"/>
       </w:pPr>
-      <w:bookmarkStart w:id="8" w:name="_Toc237877534"/>
+      <w:bookmarkStart w:id="8" w:name="_Toc238317415"/>
       <w:r>
         <w:t>2.2 Dataset</w:t>
       </w:r>
@@ -5098,7 +5025,7 @@
         <w:pStyle w:val="Heading2"/>
         <w:spacing w:line="360" w:lineRule="auto"/>
       </w:pPr>
-      <w:bookmarkStart w:id="9" w:name="_Toc237877535"/>
+      <w:bookmarkStart w:id="9" w:name="_Toc238317416"/>
       <w:r>
         <w:t>2.3 Methodology</w:t>
       </w:r>
@@ -5109,7 +5036,7 @@
         <w:pStyle w:val="Heading3"/>
         <w:spacing w:line="360" w:lineRule="auto"/>
       </w:pPr>
-      <w:bookmarkStart w:id="10" w:name="_Toc237877536"/>
+      <w:bookmarkStart w:id="10" w:name="_Toc238317417"/>
       <w:r>
         <w:t>2.3.1 Candidate Model Survey and Selection</w:t>
       </w:r>
@@ -5140,7 +5067,7 @@
         <w:pStyle w:val="Heading3"/>
         <w:spacing w:line="360" w:lineRule="auto"/>
       </w:pPr>
-      <w:bookmarkStart w:id="11" w:name="_Toc237877537"/>
+      <w:bookmarkStart w:id="11" w:name="_Toc238317418"/>
       <w:r>
         <w:t>2.3.2 Generation Prompts</w:t>
       </w:r>
@@ -6138,7 +6065,7 @@
         <w:pStyle w:val="Heading3"/>
         <w:spacing w:line="360" w:lineRule="auto"/>
       </w:pPr>
-      <w:bookmarkStart w:id="12" w:name="_Toc237877538"/>
+      <w:bookmarkStart w:id="12" w:name="_Toc238317419"/>
       <w:r>
         <w:t>2.3.3 Evaluation Methods</w:t>
       </w:r>
@@ -6294,7 +6221,7 @@
         <w:pStyle w:val="Heading3"/>
         <w:spacing w:line="360" w:lineRule="auto"/>
       </w:pPr>
-      <w:bookmarkStart w:id="13" w:name="_Toc237877539"/>
+      <w:bookmarkStart w:id="13" w:name="_Toc238317420"/>
       <w:r>
         <w:t>2.3.4 Human Validation</w:t>
       </w:r>
@@ -6367,7 +6294,7 @@
         <w:pStyle w:val="Heading3"/>
         <w:spacing w:line="360" w:lineRule="auto"/>
       </w:pPr>
-      <w:bookmarkStart w:id="14" w:name="_Toc237877540"/>
+      <w:bookmarkStart w:id="14" w:name="_Toc238317421"/>
       <w:r>
         <w:t>2.3.5 The Alt-Test: Statistical Validation of LLM-as-Judge</w:t>
       </w:r>
@@ -6525,7 +6452,7 @@
         <w:pStyle w:val="Heading3"/>
         <w:spacing w:line="360" w:lineRule="auto"/>
       </w:pPr>
-      <w:bookmarkStart w:id="15" w:name="_Toc237877541"/>
+      <w:bookmarkStart w:id="15" w:name="_Toc238317422"/>
       <w:r>
         <w:t>2.3.6 Further Statistical Analysis</w:t>
       </w:r>
@@ -6704,7 +6631,7 @@
         <w:pStyle w:val="Heading2"/>
         <w:spacing w:line="360" w:lineRule="auto"/>
       </w:pPr>
-      <w:bookmarkStart w:id="16" w:name="_Toc237877542"/>
+      <w:bookmarkStart w:id="16" w:name="_Toc238317423"/>
       <w:r>
         <w:t>2.4 Results</w:t>
       </w:r>
@@ -6715,7 +6642,7 @@
         <w:pStyle w:val="Heading3"/>
         <w:spacing w:line="360" w:lineRule="auto"/>
       </w:pPr>
-      <w:bookmarkStart w:id="17" w:name="_Toc237877543"/>
+      <w:bookmarkStart w:id="17" w:name="_Toc238317424"/>
       <w:r>
         <w:t>2.4.1 Automatic Metrics (Five-Model Survey)</w:t>
       </w:r>
@@ -7632,7 +7559,7 @@
         <w:pStyle w:val="Heading3"/>
         <w:spacing w:line="360" w:lineRule="auto"/>
       </w:pPr>
-      <w:bookmarkStart w:id="18" w:name="_Toc237877544"/>
+      <w:bookmarkStart w:id="18" w:name="_Toc238317425"/>
       <w:r>
         <w:t>2.4.2 Prompt and Model Sensitivity</w:t>
       </w:r>
@@ -7793,7 +7720,7 @@
         <w:pStyle w:val="Heading3"/>
         <w:spacing w:line="360" w:lineRule="auto"/>
       </w:pPr>
-      <w:bookmarkStart w:id="19" w:name="_Toc237877545"/>
+      <w:bookmarkStart w:id="19" w:name="_Toc238317426"/>
       <w:r>
         <w:t>2.4.3 Per-Model Rewriting Strategies</w:t>
       </w:r>
@@ -8176,7 +8103,7 @@
         <w:pStyle w:val="Heading3"/>
         <w:spacing w:line="360" w:lineRule="auto"/>
       </w:pPr>
-      <w:bookmarkStart w:id="20" w:name="_Toc237877546"/>
+      <w:bookmarkStart w:id="20" w:name="_Toc238317427"/>
       <w:r>
         <w:t>2.4.4 Alt-Test Outcome</w:t>
       </w:r>
@@ -8254,7 +8181,7 @@
         <w:pStyle w:val="Heading3"/>
         <w:spacing w:line="360" w:lineRule="auto"/>
       </w:pPr>
-      <w:bookmarkStart w:id="21" w:name="_Toc237877547"/>
+      <w:bookmarkStart w:id="21" w:name="_Toc238317428"/>
       <w:r>
         <w:t>2.4.5 Human vs. LLM-Judge Agreement</w:t>
       </w:r>
@@ -8568,7 +8495,7 @@
         <w:pStyle w:val="Heading3"/>
         <w:spacing w:line="360" w:lineRule="auto"/>
       </w:pPr>
-      <w:bookmarkStart w:id="22" w:name="_Toc237877548"/>
+      <w:bookmarkStart w:id="22" w:name="_Toc238317429"/>
       <w:r>
         <w:t>2.4.6 Qualitative Case Studies</w:t>
       </w:r>
@@ -8768,7 +8695,7 @@
         <w:pStyle w:val="Heading2"/>
         <w:spacing w:line="360" w:lineRule="auto"/>
       </w:pPr>
-      <w:bookmarkStart w:id="23" w:name="_Toc237877549"/>
+      <w:bookmarkStart w:id="23" w:name="_Toc238317430"/>
       <w:r>
         <w:t>2.5 Conclusions and the Pivot to Detection</w:t>
       </w:r>
@@ -8828,7 +8755,7 @@
         <w:pStyle w:val="Heading1"/>
         <w:spacing w:line="360" w:lineRule="auto"/>
       </w:pPr>
-      <w:bookmarkStart w:id="24" w:name="_Toc237877550"/>
+      <w:bookmarkStart w:id="24" w:name="_Toc238317431"/>
       <w:r>
         <w:lastRenderedPageBreak/>
         <w:t xml:space="preserve">3. Part II </w:t>
@@ -8846,7 +8773,7 @@
         <w:pStyle w:val="Heading2"/>
         <w:spacing w:line="360" w:lineRule="auto"/>
       </w:pPr>
-      <w:bookmarkStart w:id="25" w:name="_Toc237877551"/>
+      <w:bookmarkStart w:id="25" w:name="_Toc238317432"/>
       <w:r>
         <w:t>3.1 Problem Definition</w:t>
       </w:r>
@@ -8911,7 +8838,7 @@
         <w:pStyle w:val="Heading2"/>
         <w:spacing w:line="360" w:lineRule="auto"/>
       </w:pPr>
-      <w:bookmarkStart w:id="26" w:name="_Toc237877552"/>
+      <w:bookmarkStart w:id="26" w:name="_Toc238317433"/>
       <w:r>
         <w:t>3.2 Dataset: Sarcasm Corpus V2</w:t>
       </w:r>
@@ -8959,7 +8886,6 @@
       </w:r>
     </w:p>
     <w:p>
-      <w:pPr/>
       <w:r>
         <w:t>The source text traces back to the Internet Argument Corpus (IAC 2.0), a collection of roughly 400,000 posts drawn from online debate forums; Oraby et al. randomly sampled 30,000 posts (10-150 words each) from IAC as the pool for this corpus. Because natural sarcasm prevalence in debate-forum text is low (about 12%) and prior sarcasm corpora suffered from poor inter-annotator agreement, the authors built in two safeguards before any human ever saw the data. First, distribution skew: the not-sarcastic candidate pool was pre-filtered with high-precision sincere-language patterns (AutoSlog-TS), removing about two-thirds of clearly-sincere posts so annotators would see a more balanced, higher-signal sample rather than searching for a rare label in a mostly-sincere stream. Second, quality-controlled crowdsourcing: sarcasm labels were collected on Amazon Mechanical Turk, with each post shown as a quote-response pair (i.e. with its immediate thread context, not in isolation), annotators given an explicit definition of sarcasm plus one worked example of each class, and only workers scoring above 70% on a 20-item (10 sarcastic / 10 not) qualifying test allowed to annotate. A post entered the sarcastic set only if at least 6 of 9 independent annotators agreed (a stricter, supplementary pass used 2-of-3 agreement among a smaller pool of highly-reliable annotators) - a substantially higher-agreement bar than single-annotator or hashtag-based sarcasm labeling typically achieves. The hyperbole (HYP) and rhetorical-question (RQ) subsets were identified separately, before annotation, using hand-written linguistic pattern matchers: HYP via intensifier-plus-extreme-adjective patterns (e.g. "absolutely amazing"), RQ via a mid-post question immediately followed by a statement, on the premise that such a structure signals a rhetorical rather than an information-seeking question. The dataset's stated purpose was precisely to give the field a larger, more diverse, higher-agreement corpus than was previously available, one that could support reliable supervised learning and a systematic study of sarcasm's semantic subtypes rather than treating sarcasm as one undifferentiated phenomenon - the same three-subset structure (GEN/HYP/RQ) this project's category-level error analysis (Section 3.7) relies on directly.</w:t>
       </w:r>
@@ -8975,7 +8901,14 @@
         <w:rPr>
           <w:rFonts w:cs="Calibri"/>
         </w:rPr>
-        <w:t xml:space="preserve">The three category subsets are not disjoint phenomena but nested ones, and the audit findings below follow directly from that fact. Hyperbole and rhetorical questions are rhetorical devices frequently used to carry sarcasm, so a post belonging to either category is often also a general-sarcasm example; the category files are best read as three overlapping views of one phenomenon rather than as three separate tasks. This is why the same text appears in more than one file, why the overlap is concentrated between general sarcasm and rhetorical questions, and why the category labels are retained in the canonical dataset </w:t>
+        <w:t xml:space="preserve">The three category subsets are not disjoint phenomena but nested ones, and the audit findings below follow directly from that fact. Hyperbole and rhetorical questions are rhetorical devices frequently used to carry sarcasm, so a post belonging to either category is often also a general-sarcasm example; the category files are best read as three overlapping views of one phenomenon rather than as three separate tasks. This is why the same text appears in more than one file, why the overlap is concentrated between general sarcasm and rhetorical questions, and why the category labels are retained in the canonical </w:t>
+      </w:r>
+      <w:r>
+        <w:rPr>
+          <w:rFonts w:cs="Calibri"/>
+        </w:rPr>
+        <w:lastRenderedPageBreak/>
+        <w:t xml:space="preserve">dataset </w:t>
       </w:r>
       <w:r>
         <w:rPr>
@@ -9545,9 +9478,8 @@
         <w:pStyle w:val="Heading2"/>
         <w:spacing w:line="360" w:lineRule="auto"/>
       </w:pPr>
-      <w:bookmarkStart w:id="27" w:name="_Toc237877553"/>
-      <w:r>
-        <w:lastRenderedPageBreak/>
+      <w:bookmarkStart w:id="27" w:name="_Toc238317434"/>
+      <w:r>
         <w:t>3.3 Canonical Dataset and Split Construction</w:t>
       </w:r>
       <w:bookmarkEnd w:id="27"/>
@@ -9613,6 +9545,7 @@
         <w:rPr>
           <w:rFonts w:cs="Calibri"/>
         </w:rPr>
+        <w:lastRenderedPageBreak/>
         <w:t xml:space="preserve">Both properties address the same underlying risk from different angles. Grouped splitting is the leakage defense: if the same post appeared in training and in testing, a model could score well by recognizing text it had already seen, and the reported accuracy would measure memorization rather than generalization. Because the raw files carry no author, thread, or timestamp metadata, textual duplication is the only leakage vector that can be identified at all, and forcing every duplicate group into a single split closes it completely. Stratification addresses a different problem: with a near-balanced corpus, an unlucky random split could leave one split materially skewed toward one class, which would make Macro F1 values incomparable across splits even for a perfectly behaved model. Doing both at once requires the grouped-stratified splitter noted above, and it is also the reason the split sizes deviate slightly from the nominal 70/15/15 target </w:t>
       </w:r>
       <w:r>
@@ -10074,40 +10007,46 @@
         <w:spacing w:line="360" w:lineRule="auto"/>
       </w:pPr>
       <w:r>
+        <w:t xml:space="preserve">Sealing policy: once built, the TEST split was never touched again until every method's configuration was fully frozen </w:t>
+      </w:r>
+      <w:r>
+        <w:t>-</w:t>
+      </w:r>
+      <w:r>
+        <w:t xml:space="preserve"> no prompt iteration, no few-shot demonstration selection, no hyperparameter tuning, and no DSPy optimization step was ever run against it. This policy was corrected early in the project: the initial plan let each method evaluate TEST immediately after its own DEV run, but the team recognized that even without per-method tuning, cross-method comparisons made while methods are still being developed are a form of indirect tuning if TEST is visible during that process. TEST was therefore sealed entirely until all six methods were frozen, then each frozen configuration was evaluated on TEST exactly once.</w:t>
+      </w:r>
+    </w:p>
+    <w:p>
+      <w:pPr>
+        <w:spacing w:line="360" w:lineRule="auto"/>
+        <w:rPr>
+          <w:rFonts w:cs="Calibri"/>
+        </w:rPr>
+      </w:pPr>
+      <w:r>
+        <w:rPr>
+          <w:rFonts w:cs="Calibri"/>
+        </w:rPr>
+        <w:t xml:space="preserve">The correction described above is worth recording rather than quietly fixing, because the original plan was wrong in an instructive way. Its flaw was not per-method tuning, which was never performed against the test set; it was that six methods developed in parallel while their test scores were visible would allow the comparison itself to be tuned </w:t>
+      </w:r>
+      <w:r>
+        <w:rPr>
+          <w:rFonts w:cs="Calibri"/>
+        </w:rPr>
+        <w:t>-</w:t>
+      </w:r>
+      <w:r>
+        <w:rPr>
+          <w:rFonts w:cs="Calibri"/>
+        </w:rPr>
+        <w:t xml:space="preserve"> decisions about which variants to pursue, which to abandon, and when a method was finished would all be made with knowledge of test performance. The effect is the same as tuning on test, distributed across the project rather than located in any single step, and it inflates the final </w:t>
+      </w:r>
+      <w:r>
+        <w:rPr>
+          <w:rFonts w:cs="Calibri"/>
+        </w:rPr>
         <w:lastRenderedPageBreak/>
-        <w:t xml:space="preserve">Sealing policy: once built, the TEST split was never touched again until every method's configuration was fully frozen </w:t>
-      </w:r>
-      <w:r>
-        <w:t>-</w:t>
-      </w:r>
-      <w:r>
-        <w:t xml:space="preserve"> no prompt iteration, no few-shot demonstration selection, no hyperparameter tuning, and no DSPy optimization step was ever run against it. This policy was corrected early in the project: the initial plan let each method evaluate TEST immediately after its own DEV run, but the team recognized that even without per-method tuning, cross-method comparisons made while methods are still being developed are a form of indirect tuning if TEST is visible during that process. TEST was therefore sealed entirely until all six methods were frozen, then each frozen configuration was evaluated on TEST exactly once.</w:t>
-      </w:r>
-    </w:p>
-    <w:p>
-      <w:pPr>
-        <w:spacing w:line="360" w:lineRule="auto"/>
-        <w:rPr>
-          <w:rFonts w:cs="Calibri"/>
-        </w:rPr>
-      </w:pPr>
-      <w:r>
-        <w:rPr>
-          <w:rFonts w:cs="Calibri"/>
-        </w:rPr>
-        <w:t xml:space="preserve">The correction described above is worth recording rather than quietly fixing, because the original plan was wrong in an instructive way. Its flaw was not per-method tuning, which was never performed against the test set; it was that six methods developed in parallel while their test scores were visible would allow the comparison itself to be tuned </w:t>
-      </w:r>
-      <w:r>
-        <w:rPr>
-          <w:rFonts w:cs="Calibri"/>
-        </w:rPr>
-        <w:t>-</w:t>
-      </w:r>
-      <w:r>
-        <w:rPr>
-          <w:rFonts w:cs="Calibri"/>
-        </w:rPr>
-        <w:t xml:space="preserve"> decisions about which variants to pursue, which to abandon, and when a method was finished would all be made with knowledge of test performance. The effect is the same as tuning on test, distributed across the project rather than located in any single step, and it inflates the final numbers while leaving no trace in any individual method's procedure. Sealing the test set until all six configurations were frozen removes that channel, and it is the reason the DEV-to-TEST gaps reported in Section 3.6 can be read as genuine evidence about generalization rather than as a formality.</w:t>
+        <w:t>numbers while leaving no trace in any individual method's procedure. Sealing the test set until all six configurations were frozen removes that channel, and it is the reason the DEV-to-TEST gaps reported in Section 3.6 can be read as genuine evidence about generalization rather than as a formality.</w:t>
       </w:r>
     </w:p>
     <w:p>
@@ -10115,7 +10054,7 @@
         <w:pStyle w:val="Heading2"/>
         <w:spacing w:line="360" w:lineRule="auto"/>
       </w:pPr>
-      <w:bookmarkStart w:id="28" w:name="_Toc237877554"/>
+      <w:bookmarkStart w:id="28" w:name="_Toc238317435"/>
       <w:r>
         <w:t>3.4 Experimental Methodology</w:t>
       </w:r>
@@ -10126,7 +10065,7 @@
         <w:pStyle w:val="Heading3"/>
         <w:spacing w:line="360" w:lineRule="auto"/>
       </w:pPr>
-      <w:bookmarkStart w:id="29" w:name="_Toc237877555"/>
+      <w:bookmarkStart w:id="29" w:name="_Toc238317436"/>
       <w:r>
         <w:t>3.4.1 Role of TRAIN / DEV / TEST per Approach</w:t>
       </w:r>
@@ -10218,7 +10157,6 @@
                 <w:color w:val="FFFFFF"/>
                 <w:sz w:val="19"/>
               </w:rPr>
-              <w:lastRenderedPageBreak/>
               <w:t>Approach</w:t>
             </w:r>
           </w:p>
@@ -10649,7 +10587,14 @@
               <w:rPr>
                 <w:sz w:val="19"/>
               </w:rPr>
-              <w:t>100-example MIPROv2 optimization valset (hardcoded, even during TEST run)</w:t>
+              <w:t xml:space="preserve">100-example MIPROv2 optimization valset (hardcoded, even during TEST </w:t>
+            </w:r>
+            <w:r>
+              <w:rPr>
+                <w:sz w:val="19"/>
+              </w:rPr>
+              <w:lastRenderedPageBreak/>
+              <w:t>run)</w:t>
             </w:r>
           </w:p>
         </w:tc>
@@ -10667,6 +10612,7 @@
               <w:rPr>
                 <w:sz w:val="19"/>
               </w:rPr>
+              <w:lastRenderedPageBreak/>
               <w:t>One frozen, final evaluation of the compiled program</w:t>
             </w:r>
           </w:p>
@@ -10774,7 +10720,7 @@
         <w:pStyle w:val="Heading3"/>
         <w:spacing w:line="360" w:lineRule="auto"/>
       </w:pPr>
-      <w:bookmarkStart w:id="30" w:name="_Toc237877556"/>
+      <w:bookmarkStart w:id="30" w:name="_Toc238317437"/>
       <w:r>
         <w:t>3.4.2 Shared Evaluator</w:t>
       </w:r>
@@ -10817,14 +10763,7 @@
         <w:rPr>
           <w:rFonts w:cs="Calibri"/>
         </w:rPr>
-        <w:t xml:space="preserve"> and the divergence is diagnostic rather than incidental here, since it is precisely the signature of the sarcastic-over-prediction bias documented in Sections 3.7 and 3.8. Reporting per-class precision and recall alongside the aggregate is what makes that bias legible instead of averaged away, and storing every individual prediction is what makes the cross-</w:t>
-      </w:r>
-      <w:r>
-        <w:rPr>
-          <w:rFonts w:cs="Calibri"/>
-        </w:rPr>
-        <w:lastRenderedPageBreak/>
-        <w:t>method and error analyses possible at all: those sections compare which examples each method got wrong, which cannot be recovered from summary statistics after the fact.</w:t>
+        <w:t xml:space="preserve"> and the divergence is diagnostic rather than incidental here, since it is precisely the signature of the sarcastic-over-prediction bias documented in Sections 3.7 and 3.8. Reporting per-class precision and recall alongside the aggregate is what makes that bias legible instead of averaged away, and storing every individual prediction is what makes the cross-method and error analyses possible at all: those sections compare which examples each method got wrong, which cannot be recovered from summary statistics after the fact.</w:t>
       </w:r>
     </w:p>
     <w:p>
@@ -10832,7 +10771,7 @@
         <w:pStyle w:val="Heading2"/>
         <w:spacing w:line="360" w:lineRule="auto"/>
       </w:pPr>
-      <w:bookmarkStart w:id="31" w:name="_Toc237877557"/>
+      <w:bookmarkStart w:id="31" w:name="_Toc238317438"/>
       <w:r>
         <w:t>3.5 The Six Approaches (M1–M6)</w:t>
       </w:r>
@@ -10857,7 +10796,14 @@
         <w:rPr>
           <w:rFonts w:cs="Calibri"/>
         </w:rPr>
-        <w:t xml:space="preserve">The six approaches are best read as a ladder ordered by how much task-specific signal reaches the model, and that ordering is what gives the comparison its explanatory power. The classical baseline learns sparse lexical weights directly from the labeled training data and nothing else; it has no pre-trained knowledge of language, only correlations between surface tokens and labels in this corpus. The three prompting variants sit at the opposite extreme: an extensively pre-trained general-purpose model receives a natural-language description of the task and, in one variant, a handful of examples, but none of its parameters change and none of the corpus's statistical structure is absorbed. The optimized-prompt approach automates the search over that same interface </w:t>
+        <w:t>The six approaches are best read as a ladder ordered by how much task-specific signal reaches the model, and that ordering is what gives the comparison its explanatory power. The classical baseline learns sparse lexical weights directly from the labeled training data and nothing else; it has no pre-trained knowledge of language, only correlations between surface tokens and labels in this corpus. The three prompting variants sit at the opposite extreme: an extensively pre-trained general-purpose model receives a natural-</w:t>
+      </w:r>
+      <w:r>
+        <w:rPr>
+          <w:rFonts w:cs="Calibri"/>
+        </w:rPr>
+        <w:lastRenderedPageBreak/>
+        <w:t xml:space="preserve">language description of the task and, in one variant, a handful of examples, but none of its parameters change and none of the corpus's statistical structure is absorbed. The optimized-prompt approach automates the search over that same interface </w:t>
       </w:r>
       <w:r>
         <w:rPr>
@@ -11126,7 +11072,6 @@
               <w:rPr>
                 <w:sz w:val="19"/>
               </w:rPr>
-              <w:lastRenderedPageBreak/>
               <w:t>M3</w:t>
             </w:r>
           </w:p>
@@ -11375,7 +11320,11 @@
         <w:spacing w:line="360" w:lineRule="auto"/>
       </w:pPr>
       <w:r>
-        <w:t xml:space="preserve">M3's demonstration-selection strategy was itself compared before freezing: random selection of 8 demonstrations outperformed a curated selection on DEV, so random selection was frozen for the final configuration. M5's prompt was optimized end-to-end by DSPy's MIPROv2 algorithm rather than hand-written </w:t>
+        <w:t xml:space="preserve">M3's demonstration-selection strategy was itself compared before freezing: random selection of 8 demonstrations outperformed a curated selection on DEV, so random selection was frozen for the final </w:t>
+      </w:r>
+      <w:r>
+        <w:lastRenderedPageBreak/>
+        <w:t xml:space="preserve">configuration. M5's prompt was optimized end-to-end by DSPy's MIPROv2 algorithm rather than hand-written </w:t>
       </w:r>
       <w:r>
         <w:t>-</w:t>
@@ -11578,7 +11527,6 @@
           <w:rFonts w:ascii="Consolas" w:hAnsi="Consolas" w:cs="Consolas"/>
           <w:sz w:val="19"/>
         </w:rPr>
-        <w:lastRenderedPageBreak/>
         <w:t xml:space="preserve">  straightforward opinion, question, or argument, even if the topic is negative or the tone is blunt.</w:t>
       </w:r>
     </w:p>
@@ -11779,6 +11727,7 @@
           <w:rFonts w:ascii="Consolas" w:hAnsi="Consolas" w:cs="Consolas"/>
           <w:sz w:val="19"/>
         </w:rPr>
+        <w:lastRenderedPageBreak/>
         <w:t xml:space="preserve">  typically used to mock, criticize, or express contempt/irritation through irony, exaggeration,</w:t>
       </w:r>
     </w:p>
@@ -12068,7 +12017,6 @@
           <w:rFonts w:ascii="Consolas" w:hAnsi="Consolas" w:cs="Consolas"/>
           <w:sz w:val="19"/>
         </w:rPr>
-        <w:lastRenderedPageBreak/>
         <w:t>Task: decide whether the given English sentence is sarcastic or not sarcastic.</w:t>
       </w:r>
     </w:p>
@@ -12256,6 +12204,7 @@
           <w:rFonts w:ascii="Consolas" w:hAnsi="Consolas" w:cs="Consolas"/>
           <w:sz w:val="19"/>
         </w:rPr>
+        <w:lastRenderedPageBreak/>
         <w:t>- sarcastic: the writer's real intended meaning differs from (often opposes) the literal meaning.</w:t>
       </w:r>
     </w:p>
@@ -12421,51 +12370,57 @@
         <w:pStyle w:val="Heading2"/>
         <w:spacing w:line="360" w:lineRule="auto"/>
       </w:pPr>
-      <w:bookmarkStart w:id="32" w:name="_Toc237877558"/>
-      <w:r>
+      <w:bookmarkStart w:id="32" w:name="_Toc238317439"/>
+      <w:r>
+        <w:t>3.6 Results</w:t>
+      </w:r>
+      <w:bookmarkEnd w:id="32"/>
+    </w:p>
+    <w:p>
+      <w:pPr>
+        <w:spacing w:line="360" w:lineRule="auto"/>
+      </w:pPr>
+      <w:r>
+        <w:t xml:space="preserve">All numbers below are on the frozen canonical TEST split (1,340 examples, gold distribution 656 sarcastic / 684 not_sarcastic), each a single, one-shot evaluation of an already-frozen configuration </w:t>
+      </w:r>
+      <w:r>
+        <w:t>-</w:t>
+      </w:r>
+      <w:r>
+        <w:t xml:space="preserve"> never a number selected from among several TEST attempts. DEV is included alongside as a sanity check on generalization (Section 3.9).</w:t>
+      </w:r>
+    </w:p>
+    <w:p>
+      <w:pPr>
+        <w:spacing w:line="360" w:lineRule="auto"/>
+        <w:rPr>
+          <w:rFonts w:cs="Calibri"/>
+        </w:rPr>
+      </w:pPr>
+      <w:r>
+        <w:rPr>
+          <w:rFonts w:cs="Calibri"/>
+        </w:rPr>
+        <w:t xml:space="preserve">Two conventions are needed to read the tables that follow. First, Macro F1 and accuracy are reported side by side, and the size of the gap between them is itself informative: for the two methods trained on the corpus's labels the two figures are nearly identical, as expected on a near-balanced test set from a balanced predictor, while for every prompted variant accuracy exceeds Macro F1 by a visible margin </w:t>
+      </w:r>
+      <w:r>
+        <w:rPr>
+          <w:rFonts w:cs="Calibri"/>
+        </w:rPr>
+        <w:t>-</w:t>
+      </w:r>
+      <w:r>
+        <w:rPr>
+          <w:rFonts w:cs="Calibri"/>
+        </w:rPr>
+        <w:t xml:space="preserve"> the arithmetic signature of a classifier that is right about one class far more often than the other. Second, the development-to-test gap is included not as an extra performance measure but as a check on the experimental design: because no method was ever tuned against the test split, a large gap would indicate </w:t>
+      </w:r>
+      <w:r>
+        <w:rPr>
+          <w:rFonts w:cs="Calibri"/>
+        </w:rPr>
         <w:lastRenderedPageBreak/>
-        <w:t>3.6 Results</w:t>
-      </w:r>
-      <w:bookmarkEnd w:id="32"/>
-    </w:p>
-    <w:p>
-      <w:pPr>
-        <w:spacing w:line="360" w:lineRule="auto"/>
-      </w:pPr>
-      <w:r>
-        <w:t xml:space="preserve">All numbers below are on the frozen canonical TEST split (1,340 examples, gold distribution 656 sarcastic / 684 not_sarcastic), each a single, one-shot evaluation of an already-frozen configuration </w:t>
-      </w:r>
-      <w:r>
-        <w:t>-</w:t>
-      </w:r>
-      <w:r>
-        <w:t xml:space="preserve"> never a number selected from among several TEST attempts. DEV is included alongside as a sanity check on generalization (Section 3.9).</w:t>
-      </w:r>
-    </w:p>
-    <w:p>
-      <w:pPr>
-        <w:spacing w:line="360" w:lineRule="auto"/>
-        <w:rPr>
-          <w:rFonts w:cs="Calibri"/>
-        </w:rPr>
-      </w:pPr>
-      <w:r>
-        <w:rPr>
-          <w:rFonts w:cs="Calibri"/>
-        </w:rPr>
-        <w:t xml:space="preserve">Two conventions are needed to read the tables that follow. First, Macro F1 and accuracy are reported side by side, and the size of the gap between them is itself informative: for the two methods trained on the corpus's labels the two figures are nearly identical, as expected on a near-balanced test set from a balanced predictor, while for every prompted variant accuracy exceeds Macro F1 by a visible margin </w:t>
-      </w:r>
-      <w:r>
-        <w:rPr>
-          <w:rFonts w:cs="Calibri"/>
-        </w:rPr>
-        <w:t>-</w:t>
-      </w:r>
-      <w:r>
-        <w:rPr>
-          <w:rFonts w:cs="Calibri"/>
-        </w:rPr>
-        <w:t xml:space="preserve"> the arithmetic signature of a classifier that is right about one class far more often than the other. Second, the development-to-test gap is included not as an extra performance measure but as a check on the experimental design: because no method was ever tuned against the test split, a large gap would indicate either a leaky split or overfitting to the development set during method selection. The gaps are uniformly small and negative, which is the pattern a well-controlled comparison should produce.</w:t>
+        <w:t>either a leaky split or overfitting to the development set during method selection. The gaps are uniformly small and negative, which is the pattern a well-controlled comparison should produce.</w:t>
       </w:r>
     </w:p>
     <w:tbl>
@@ -13554,7 +13509,6 @@
               <w:rPr>
                 <w:sz w:val="17"/>
               </w:rPr>
-              <w:lastRenderedPageBreak/>
               <w:t>M5 DSPy MIPROv2</w:t>
             </w:r>
           </w:p>
@@ -13969,6 +13923,7 @@
         <w:rPr>
           <w:rFonts w:cs="Calibri"/>
         </w:rPr>
+        <w:lastRenderedPageBreak/>
         <w:t xml:space="preserve">The cost and latency columns deserve as much weight as the accuracy columns when the comparison is read as guidance for deployment rather than as a ranking. All six approaches ran at zero marginal cost here only because the language model was self-hosted; against a metered API the per-example inference cost of the prompted methods would scale linearly with traffic, while the fine-tuned encoder's cost is dominated by a single one-time training run whose amortized share falls to nothing as volume grows. The latency figures point the same way and more sharply: the prompted variants require seconds of generation per example, whereas the encoder performs a single forward pass, and the classical baseline a sparse dot product. In this comparison the method with the highest accuracy is also among the cheapest and fastest to run, which is an unusually clean outcome </w:t>
       </w:r>
       <w:r>
@@ -13992,7 +13947,6 @@
         <w:rPr>
           <w:noProof/>
         </w:rPr>
-        <w:lastRenderedPageBreak/>
         <w:drawing>
           <wp:inline distT="0" distB="0" distL="0" distR="0" wp14:anchorId="73943422" wp14:editId="17A0E21B">
             <wp:extent cx="5303520" cy="3515407"/>
@@ -14047,6 +14001,7 @@
         <w:rPr>
           <w:noProof/>
         </w:rPr>
+        <w:lastRenderedPageBreak/>
         <w:drawing>
           <wp:inline distT="0" distB="0" distL="0" distR="0" wp14:anchorId="120EF2EA" wp14:editId="6289AAF6">
             <wp:extent cx="5303520" cy="3515407"/>
@@ -14101,7 +14056,6 @@
         <w:rPr>
           <w:noProof/>
         </w:rPr>
-        <w:lastRenderedPageBreak/>
         <w:drawing>
           <wp:inline distT="0" distB="0" distL="0" distR="0" wp14:anchorId="567082CC" wp14:editId="3556A75F">
             <wp:extent cx="5303520" cy="3041300"/>
@@ -14153,7 +14107,7 @@
         <w:pStyle w:val="Heading3"/>
         <w:spacing w:line="360" w:lineRule="auto"/>
       </w:pPr>
-      <w:bookmarkStart w:id="33" w:name="_Toc237877559"/>
+      <w:bookmarkStart w:id="33" w:name="_Toc238317440"/>
       <w:r>
         <w:t>3.6.1 M5's Actual Optimized Prompt</w:t>
       </w:r>
@@ -14167,7 +14121,11 @@
         <w:t>-</w:t>
       </w:r>
       <w:r>
-        <w:t xml:space="preserve"> only the full MIPROv2 search (0.6700) improved on plain Predict, and by a modest margin, which is itself informative about how much headroom prompt optimization had on this task.</w:t>
+        <w:t xml:space="preserve"> only the full MIPROv2 </w:t>
+      </w:r>
+      <w:r>
+        <w:lastRenderedPageBreak/>
+        <w:t>search (0.6700) improved on plain Predict, and by a modest margin, which is itself informative about how much headroom prompt optimization had on this task.</w:t>
       </w:r>
     </w:p>
     <w:p>
@@ -14241,11 +14199,7 @@
         <w:t>-</w:t>
       </w:r>
       <w:r>
-        <w:t xml:space="preserve"> the </w:t>
-      </w:r>
-      <w:r>
-        <w:lastRenderedPageBreak/>
-        <w:t>text above is the instruction actually used to produce the reported TEST result, not necessarily the one a re-run would reproduce exactly.</w:t>
+        <w:t xml:space="preserve"> the text above is the instruction actually used to produce the reported TEST result, not necessarily the one a re-run would reproduce exactly.</w:t>
       </w:r>
     </w:p>
     <w:p>
@@ -14431,6 +14385,7 @@
         <w:spacing w:line="360" w:lineRule="auto"/>
       </w:pPr>
       <w:r>
+        <w:lastRenderedPageBreak/>
         <w:t xml:space="preserve">Notably, the compiled program used only 4 few-shot demonstrations </w:t>
       </w:r>
       <w:r>
@@ -14507,14 +14462,7 @@
         <w:rPr>
           <w:rFonts w:cs="Calibri"/>
         </w:rPr>
-        <w:t xml:space="preserve">The demonstration count is the more interesting result of the two. That an optimized program using fewer demonstrations outperformed a fixed configuration using twice as many indicates that, at this scale, </w:t>
-      </w:r>
-      <w:r>
-        <w:rPr>
-          <w:rFonts w:cs="Calibri"/>
-        </w:rPr>
-        <w:lastRenderedPageBreak/>
-        <w:t>which examples appear in the context matters more than how many. This is also a caution about the standard practice of adding demonstrations until the context window fills: additional examples are not free, since they lengthen every request, slow inference, and can crowd the instruction they were meant to support.</w:t>
+        <w:t>The demonstration count is the more interesting result of the two. That an optimized program using fewer demonstrations outperformed a fixed configuration using twice as many indicates that, at this scale, which examples appear in the context matters more than how many. This is also a caution about the standard practice of adding demonstrations until the context window fills: additional examples are not free, since they lengthen every request, slow inference, and can crowd the instruction they were meant to support.</w:t>
       </w:r>
     </w:p>
     <w:p>
@@ -14522,7 +14470,7 @@
         <w:pStyle w:val="Heading2"/>
         <w:spacing w:line="360" w:lineRule="auto"/>
       </w:pPr>
-      <w:bookmarkStart w:id="34" w:name="_Toc237877560"/>
+      <w:bookmarkStart w:id="34" w:name="_Toc238317441"/>
       <w:r>
         <w:t>3.7 Cross-Model Comparison</w:t>
       </w:r>
@@ -14581,7 +14529,11 @@
         <w:t xml:space="preserve">Systematic sarcastic-over-prediction bias in every LLM method, confirmed on TEST: </w:t>
       </w:r>
       <w:r>
-        <w:t xml:space="preserve">M2 FP=465/FN=18, M3 FP=470/FN=19, M4 FP=489/FN=17, M5 (best-calibrated of the four, still skewed) FP=382/FN=38. M1 and M6 are far more balanced: M1 FP=189/FN=159, M6 FP=127/FN=113. This is the single biggest driver of the gap between M6/M1 and the LLM methods </w:t>
+        <w:t xml:space="preserve">M2 FP=465/FN=18, M3 FP=470/FN=19, M4 FP=489/FN=17, M5 (best-calibrated of the four, still skewed) </w:t>
+      </w:r>
+      <w:r>
+        <w:lastRenderedPageBreak/>
+        <w:t xml:space="preserve">FP=382/FN=38. M1 and M6 are far more balanced: M1 FP=189/FN=159, M6 FP=127/FN=113. This is the single biggest driver of the gap between M6/M1 and the LLM methods </w:t>
       </w:r>
       <w:r>
         <w:t>-</w:t>
@@ -14643,14 +14595,7 @@
         <w:rPr>
           <w:rFonts w:cs="Calibri"/>
         </w:rPr>
-        <w:t xml:space="preserve">The mechanism behind the over-prediction bias is worth stating explicitly, because it shapes what would and would not fix it. A prompted instruction-tuned model is not producing a calibrated probability and then thresholding it; it is generating the more plausible continuation given a question that names sarcasm as the thing being looked for. Asking whether a text is sarcastic makes the sarcastic reading salient, and </w:t>
-      </w:r>
-      <w:r>
-        <w:rPr>
-          <w:rFonts w:cs="Calibri"/>
-        </w:rPr>
-        <w:lastRenderedPageBreak/>
-        <w:t xml:space="preserve">any local feature that could support that reading </w:t>
+        <w:t xml:space="preserve">The mechanism behind the over-prediction bias is worth stating explicitly, because it shapes what would and would not fix it. A prompted instruction-tuned model is not producing a calibrated probability and then thresholding it; it is generating the more plausible continuation given a question that names sarcasm as the thing being looked for. Asking whether a text is sarcastic makes the sarcastic reading salient, and any local feature that could support that reading </w:t>
       </w:r>
       <w:r>
         <w:rPr>
@@ -14829,7 +14774,7 @@
         <w:pStyle w:val="Heading2"/>
         <w:spacing w:line="360" w:lineRule="auto"/>
       </w:pPr>
-      <w:bookmarkStart w:id="35" w:name="_Toc237877561"/>
+      <w:bookmarkStart w:id="35" w:name="_Toc238317442"/>
       <w:r>
         <w:lastRenderedPageBreak/>
         <w:t>3.8 Error Analysis</w:t>
@@ -15040,7 +14985,7 @@
         <w:pStyle w:val="Heading2"/>
         <w:spacing w:line="360" w:lineRule="auto"/>
       </w:pPr>
-      <w:bookmarkStart w:id="36" w:name="_Toc237877562"/>
+      <w:bookmarkStart w:id="36" w:name="_Toc238317443"/>
       <w:r>
         <w:t>3.9 Conclusions</w:t>
       </w:r>
@@ -15201,7 +15146,7 @@
         <w:pStyle w:val="Heading2"/>
         <w:spacing w:line="360" w:lineRule="auto"/>
       </w:pPr>
-      <w:bookmarkStart w:id="37" w:name="_Toc237877563"/>
+      <w:bookmarkStart w:id="37" w:name="_Toc238317444"/>
       <w:r>
         <w:t>3.10 Limitations</w:t>
       </w:r>
@@ -15266,14 +15211,11 @@
         <w:t>-</w:t>
       </w:r>
       <w:r>
-        <w:t xml:space="preserve"> the systematic sarcastic-over-prediction bias and the "more sophistication doesn't help" finding are </w:t>
+        <w:t xml:space="preserve"> the systematic sarcastic-over-prediction bias and the "more sophistication doesn't help" finding are demonstrated for this model/hardware combination specifically, not proven to generalize to other </w:t>
       </w:r>
       <w:r>
         <w:lastRenderedPageBreak/>
-        <w:t>demonstrated for this model/hardware combination specifically, not proven to generalize to other LLMs or newer hardware without further testing.</w:t>
-      </w:r>
-      <w:r>
-        <w:t xml:space="preserve"> Part III's SIGN generalization phase provides partial evidence on this exact question: the same Qwen3-4B, zero-shot, detects 93.6% of SIGN's sarcastic originals (Task A) -- well above M6's 63.8% on the identical task -- suggesting the weakness on Dataset A is more likely a calibration problem specific to prompted binary classification than a fundamental inability to recognize sarcasm (see Part III, section 4.1).</w:t>
+        <w:t>LLMs or newer hardware without further testing. Part III's SIGN generalization phase provides partial evidence on this exact question: the same Qwen3-4B, zero-shot, detects 93.6% of SIGN's sarcastic originals (Task A) -- well above M6's 63.8% on the identical task -- suggesting the weakness on Dataset A is more likely a calibration problem specific to prompted binary classification than a fundamental inability to recognize sarcasm (see Part III, section 4.1).</w:t>
       </w:r>
     </w:p>
     <w:p>
@@ -15305,7 +15247,7 @@
         <w:pStyle w:val="Heading2"/>
         <w:spacing w:line="360" w:lineRule="auto"/>
       </w:pPr>
-      <w:bookmarkStart w:id="38" w:name="_Toc237877564"/>
+      <w:bookmarkStart w:id="38" w:name="_Toc238317445"/>
       <w:r>
         <w:t>3.11 Recommended Production Approach</w:t>
       </w:r>
@@ -15421,8 +15363,9 @@
         <w:pStyle w:val="Heading2"/>
         <w:spacing w:line="360" w:lineRule="auto"/>
       </w:pPr>
-      <w:bookmarkStart w:id="39" w:name="_Toc237877565"/>
-      <w:r>
+      <w:bookmarkStart w:id="39" w:name="_Toc238317446"/>
+      <w:r>
+        <w:lastRenderedPageBreak/>
         <w:t>3.12 Future Work</w:t>
       </w:r>
       <w:bookmarkEnd w:id="39"/>
@@ -15457,7 +15400,6 @@
         <w:rPr>
           <w:b/>
         </w:rPr>
-        <w:lastRenderedPageBreak/>
         <w:t xml:space="preserve">Multi-seed variance estimate for M6 </w:t>
       </w:r>
       <w:r>
@@ -15583,18 +15525,19 @@
       <w:pPr>
         <w:pStyle w:val="Heading1"/>
       </w:pPr>
-      <w:r>
+      <w:bookmarkStart w:id="40" w:name="_Toc238317447"/>
+      <w:r>
+        <w:lastRenderedPageBreak/>
         <w:t>4. Part III - SIGN Generalization</w:t>
       </w:r>
-    </w:p>
-    <w:p>
-      <w:pPr/>
+      <w:bookmarkEnd w:id="40"/>
+    </w:p>
+    <w:p>
       <w:r>
         <w:t>A third, additive phase investigates how well Part II's six frozen classifiers (M1-M6) generalize beyond Sarcasm Corpus V2 to the structurally different SIGN dataset (Peled &amp; Reichart, 2017) - sarcastic tweets, each with up to five independent human non-sarcastic interpretations. This phase is strictly additive: Part II's frozen configurations, predictions, and metrics are read-only inputs here, never modified. Full technical detail beyond the scope of this section - every persisted experiment, the complete methodology, and the full audit trail - is available in the project repository's SIGN_GENERALIZATION_PLAN.md and EXPERIMENT_LOG.md.</w:t>
       </w:r>
     </w:p>
     <w:p>
-      <w:pPr/>
       <w:r>
         <w:t>Every SIGN original is, by construction, sarcastic; every interpretation is, by construction, not_sarcastic. Two different questions get asked of the same predictions throughout this section, and they are never conflated: Task A (“can the model recognize a SIGN sarcastic tweet at all?” - originals only, sarcasm detection rate is the metric) and Task B (“can the model tell that sarcastic original apart from a sincere rewrite of the same underlying meaning?” - the full contrastive set, Macro F1 is the metric). A low Task B score must never be read as “the model can't detect sarcasm” without checking Task A - several methods below score above 90% on Task A while scoring under 0.40 Macro F1 on Task B, because their failure is entirely on the interpretation side, not the original side.</w:t>
       </w:r>
@@ -15603,15 +15546,17 @@
       <w:pPr>
         <w:pStyle w:val="Heading2"/>
       </w:pPr>
+      <w:bookmarkStart w:id="41" w:name="_Toc238317448"/>
       <w:r>
         <w:t>4.1 Cross-Dataset Sarcasm Detection (Task A)</w:t>
       </w:r>
+      <w:bookmarkEnd w:id="41"/>
     </w:p>
     <w:tbl>
       <w:tblPr>
         <w:tblStyle w:val="TableGrid"/>
-        <w:tblW w:type="auto" w:w="0"/>
-        <w:tblLook w:firstColumn="1" w:firstRow="1" w:lastColumn="0" w:lastRow="0" w:noHBand="0" w:noVBand="1" w:val="04A0"/>
+        <w:tblW w:w="0" w:type="auto"/>
+        <w:tblLook w:val="04A0" w:firstRow="1" w:lastRow="0" w:firstColumn="1" w:lastColumn="0" w:noHBand="0" w:noVBand="1"/>
       </w:tblPr>
       <w:tblGrid>
         <w:gridCol w:w="4759"/>
@@ -15620,7 +15565,7 @@
       <w:tr>
         <w:tc>
           <w:tcPr>
-            <w:tcW w:type="dxa" w:w="4759"/>
+            <w:tcW w:w="4759" w:type="dxa"/>
           </w:tcPr>
           <w:p>
             <w:r>
@@ -15633,7 +15578,7 @@
         </w:tc>
         <w:tc>
           <w:tcPr>
-            <w:tcW w:type="dxa" w:w="4759"/>
+            <w:tcW w:w="4759" w:type="dxa"/>
           </w:tcPr>
           <w:p>
             <w:r>
@@ -15648,7 +15593,7 @@
       <w:tr>
         <w:tc>
           <w:tcPr>
-            <w:tcW w:type="dxa" w:w="4759"/>
+            <w:tcW w:w="4759" w:type="dxa"/>
           </w:tcPr>
           <w:p>
             <w:r>
@@ -15658,7 +15603,7 @@
         </w:tc>
         <w:tc>
           <w:tcPr>
-            <w:tcW w:type="dxa" w:w="4759"/>
+            <w:tcW w:w="4759" w:type="dxa"/>
           </w:tcPr>
           <w:p>
             <w:r>
@@ -15670,7 +15615,7 @@
       <w:tr>
         <w:tc>
           <w:tcPr>
-            <w:tcW w:type="dxa" w:w="4759"/>
+            <w:tcW w:w="4759" w:type="dxa"/>
           </w:tcPr>
           <w:p>
             <w:r>
@@ -15680,7 +15625,7 @@
         </w:tc>
         <w:tc>
           <w:tcPr>
-            <w:tcW w:type="dxa" w:w="4759"/>
+            <w:tcW w:w="4759" w:type="dxa"/>
           </w:tcPr>
           <w:p>
             <w:r>
@@ -15692,7 +15637,7 @@
       <w:tr>
         <w:tc>
           <w:tcPr>
-            <w:tcW w:type="dxa" w:w="4759"/>
+            <w:tcW w:w="4759" w:type="dxa"/>
           </w:tcPr>
           <w:p>
             <w:r>
@@ -15702,7 +15647,7 @@
         </w:tc>
         <w:tc>
           <w:tcPr>
-            <w:tcW w:type="dxa" w:w="4759"/>
+            <w:tcW w:w="4759" w:type="dxa"/>
           </w:tcPr>
           <w:p>
             <w:r>
@@ -15714,7 +15659,7 @@
       <w:tr>
         <w:tc>
           <w:tcPr>
-            <w:tcW w:type="dxa" w:w="4759"/>
+            <w:tcW w:w="4759" w:type="dxa"/>
           </w:tcPr>
           <w:p>
             <w:r>
@@ -15724,7 +15669,7 @@
         </w:tc>
         <w:tc>
           <w:tcPr>
-            <w:tcW w:type="dxa" w:w="4759"/>
+            <w:tcW w:w="4759" w:type="dxa"/>
           </w:tcPr>
           <w:p>
             <w:r>
@@ -15736,7 +15681,7 @@
       <w:tr>
         <w:tc>
           <w:tcPr>
-            <w:tcW w:type="dxa" w:w="4759"/>
+            <w:tcW w:w="4759" w:type="dxa"/>
           </w:tcPr>
           <w:p>
             <w:r>
@@ -15746,7 +15691,7 @@
         </w:tc>
         <w:tc>
           <w:tcPr>
-            <w:tcW w:type="dxa" w:w="4759"/>
+            <w:tcW w:w="4759" w:type="dxa"/>
           </w:tcPr>
           <w:p>
             <w:r>
@@ -15758,7 +15703,7 @@
       <w:tr>
         <w:tc>
           <w:tcPr>
-            <w:tcW w:type="dxa" w:w="4759"/>
+            <w:tcW w:w="4759" w:type="dxa"/>
           </w:tcPr>
           <w:p>
             <w:r>
@@ -15768,7 +15713,7 @@
         </w:tc>
         <w:tc>
           <w:tcPr>
-            <w:tcW w:type="dxa" w:w="4759"/>
+            <w:tcW w:w="4759" w:type="dxa"/>
           </w:tcPr>
           <w:p>
             <w:r>
@@ -15779,20 +15724,18 @@
       </w:tr>
     </w:tbl>
     <w:p>
-      <w:pPr/>
       <w:r>
         <w:t>Table 10. SIGN Task A - sarcasm detection rate, zero-transfer (no SIGN Train exposure).</w:t>
       </w:r>
     </w:p>
     <w:p>
-      <w:pPr/>
       <w:r>
         <w:t>Every method, including the weakest, still recognizes the clear majority of unseen SIGN sarcastic tweets zero-shot - sarcasm detection transfers across the domain shift reasonably well on its own. The LLM-prompted methods (M2-M4) transfer best on this narrow task, ahead of both label-trained methods (M1, M6) - the reverse of Part II's Dataset A ranking, where M6 led by a wide margin.</w:t>
       </w:r>
     </w:p>
     <w:p>
-      <w:pPr/>
-      <w:r>
+      <w:r>
+        <w:lastRenderedPageBreak/>
         <w:t>This result bears directly on an open question from Part II: is the LLM-prompting family's weaker Dataset A performance (0.58-0.67 Macro F1 vs. M6's 0.82, essentially unmoved across four very different prompting strategies - zero-shot, few-shot, structured reasoning, DSPy-optimized) a limitation of prompting as an approach, or of the specific 4B-parameter Qwen model being too small to grasp sarcasm's nuance? If the latter, a materially larger or stronger LLM should close the gap; if the former, it likely would not. This SIGN result is evidence against the “model too weak to understand sarcasm” reading: the same Qwen3-4B, zero-shot, detects 93.6% of SIGN's sarcastic originals - well above M6's 63.8% on the identical task. A model that could not grasp sarcasm at all would not out-detect a purpose-built fine-tuned classifier on unseen data. The more consistent picture is that Qwen's weakness on Dataset A is a calibration / decision-boundary problem specific to binary classification under prompting - it over-triggers the sarcastic label (Part II §3.7: FP≥382 vs. FN≤38 for every LLM method) rather than failing to recognize sarcasm's linguistic signal. This does not fully resolve the model-vs-approach question - a materially stronger LLM was not tested, and Task A's single-gold-class setting sidesteps exactly the calibration problem that hurts Task B - but it substantially narrows which explanation the evidence supports, and is a natural next step for future work (§3.12).</w:t>
       </w:r>
     </w:p>
@@ -15800,15 +15743,17 @@
       <w:pPr>
         <w:pStyle w:val="Heading2"/>
       </w:pPr>
+      <w:bookmarkStart w:id="42" w:name="_Toc238317449"/>
       <w:r>
         <w:t>4.2 Contrastive Sarcasm Recognition (Task B)</w:t>
       </w:r>
+      <w:bookmarkEnd w:id="42"/>
     </w:p>
     <w:tbl>
       <w:tblPr>
         <w:tblStyle w:val="TableGrid"/>
-        <w:tblW w:type="auto" w:w="0"/>
-        <w:tblLook w:firstColumn="1" w:firstRow="1" w:lastColumn="0" w:lastRow="0" w:noHBand="0" w:noVBand="1" w:val="04A0"/>
+        <w:tblW w:w="0" w:type="auto"/>
+        <w:tblLook w:val="04A0" w:firstRow="1" w:lastRow="0" w:firstColumn="1" w:lastColumn="0" w:noHBand="0" w:noVBand="1"/>
       </w:tblPr>
       <w:tblGrid>
         <w:gridCol w:w="3173"/>
@@ -15818,7 +15763,7 @@
       <w:tr>
         <w:tc>
           <w:tcPr>
-            <w:tcW w:type="dxa" w:w="3173"/>
+            <w:tcW w:w="3173" w:type="dxa"/>
           </w:tcPr>
           <w:p>
             <w:r>
@@ -15831,7 +15776,7 @@
         </w:tc>
         <w:tc>
           <w:tcPr>
-            <w:tcW w:type="dxa" w:w="3173"/>
+            <w:tcW w:w="3173" w:type="dxa"/>
           </w:tcPr>
           <w:p>
             <w:r>
@@ -15844,7 +15789,7 @@
         </w:tc>
         <w:tc>
           <w:tcPr>
-            <w:tcW w:type="dxa" w:w="3173"/>
+            <w:tcW w:w="3173" w:type="dxa"/>
           </w:tcPr>
           <w:p>
             <w:r>
@@ -15859,7 +15804,7 @@
       <w:tr>
         <w:tc>
           <w:tcPr>
-            <w:tcW w:type="dxa" w:w="3173"/>
+            <w:tcW w:w="3173" w:type="dxa"/>
           </w:tcPr>
           <w:p>
             <w:r>
@@ -15869,7 +15814,7 @@
         </w:tc>
         <w:tc>
           <w:tcPr>
-            <w:tcW w:type="dxa" w:w="3173"/>
+            <w:tcW w:w="3173" w:type="dxa"/>
           </w:tcPr>
           <w:p>
             <w:r>
@@ -15879,7 +15824,7 @@
         </w:tc>
         <w:tc>
           <w:tcPr>
-            <w:tcW w:type="dxa" w:w="3173"/>
+            <w:tcW w:w="3173" w:type="dxa"/>
           </w:tcPr>
           <w:p>
             <w:r>
@@ -15891,7 +15836,7 @@
       <w:tr>
         <w:tc>
           <w:tcPr>
-            <w:tcW w:type="dxa" w:w="3173"/>
+            <w:tcW w:w="3173" w:type="dxa"/>
           </w:tcPr>
           <w:p>
             <w:r>
@@ -15901,7 +15846,7 @@
         </w:tc>
         <w:tc>
           <w:tcPr>
-            <w:tcW w:type="dxa" w:w="3173"/>
+            <w:tcW w:w="3173" w:type="dxa"/>
           </w:tcPr>
           <w:p>
             <w:r>
@@ -15911,7 +15856,7 @@
         </w:tc>
         <w:tc>
           <w:tcPr>
-            <w:tcW w:type="dxa" w:w="3173"/>
+            <w:tcW w:w="3173" w:type="dxa"/>
           </w:tcPr>
           <w:p>
             <w:r>
@@ -15923,7 +15868,7 @@
       <w:tr>
         <w:tc>
           <w:tcPr>
-            <w:tcW w:type="dxa" w:w="3173"/>
+            <w:tcW w:w="3173" w:type="dxa"/>
           </w:tcPr>
           <w:p>
             <w:r>
@@ -15933,7 +15878,7 @@
         </w:tc>
         <w:tc>
           <w:tcPr>
-            <w:tcW w:type="dxa" w:w="3173"/>
+            <w:tcW w:w="3173" w:type="dxa"/>
           </w:tcPr>
           <w:p>
             <w:r>
@@ -15943,7 +15888,7 @@
         </w:tc>
         <w:tc>
           <w:tcPr>
-            <w:tcW w:type="dxa" w:w="3173"/>
+            <w:tcW w:w="3173" w:type="dxa"/>
           </w:tcPr>
           <w:p>
             <w:r>
@@ -15955,7 +15900,7 @@
       <w:tr>
         <w:tc>
           <w:tcPr>
-            <w:tcW w:type="dxa" w:w="3173"/>
+            <w:tcW w:w="3173" w:type="dxa"/>
           </w:tcPr>
           <w:p>
             <w:r>
@@ -15965,7 +15910,7 @@
         </w:tc>
         <w:tc>
           <w:tcPr>
-            <w:tcW w:type="dxa" w:w="3173"/>
+            <w:tcW w:w="3173" w:type="dxa"/>
           </w:tcPr>
           <w:p>
             <w:r>
@@ -15975,7 +15920,7 @@
         </w:tc>
         <w:tc>
           <w:tcPr>
-            <w:tcW w:type="dxa" w:w="3173"/>
+            <w:tcW w:w="3173" w:type="dxa"/>
           </w:tcPr>
           <w:p>
             <w:r>
@@ -15987,7 +15932,7 @@
       <w:tr>
         <w:tc>
           <w:tcPr>
-            <w:tcW w:type="dxa" w:w="3173"/>
+            <w:tcW w:w="3173" w:type="dxa"/>
           </w:tcPr>
           <w:p>
             <w:r>
@@ -15997,7 +15942,7 @@
         </w:tc>
         <w:tc>
           <w:tcPr>
-            <w:tcW w:type="dxa" w:w="3173"/>
+            <w:tcW w:w="3173" w:type="dxa"/>
           </w:tcPr>
           <w:p>
             <w:r>
@@ -16007,7 +15952,7 @@
         </w:tc>
         <w:tc>
           <w:tcPr>
-            <w:tcW w:type="dxa" w:w="3173"/>
+            <w:tcW w:w="3173" w:type="dxa"/>
           </w:tcPr>
           <w:p>
             <w:r>
@@ -16019,7 +15964,7 @@
       <w:tr>
         <w:tc>
           <w:tcPr>
-            <w:tcW w:type="dxa" w:w="3173"/>
+            <w:tcW w:w="3173" w:type="dxa"/>
           </w:tcPr>
           <w:p>
             <w:r>
@@ -16029,7 +15974,7 @@
         </w:tc>
         <w:tc>
           <w:tcPr>
-            <w:tcW w:type="dxa" w:w="3173"/>
+            <w:tcW w:w="3173" w:type="dxa"/>
           </w:tcPr>
           <w:p>
             <w:r>
@@ -16039,7 +15984,7 @@
         </w:tc>
         <w:tc>
           <w:tcPr>
-            <w:tcW w:type="dxa" w:w="3173"/>
+            <w:tcW w:w="3173" w:type="dxa"/>
           </w:tcPr>
           <w:p>
             <w:r>
@@ -16050,13 +15995,11 @@
       </w:tr>
     </w:tbl>
     <w:p>
-      <w:pPr/>
       <w:r>
         <w:t>Table 11. SIGN Task B - full contrastive Macro F1, zero-transfer and after domain adaptation (M1/M6 only, see §4.7).</w:t>
       </w:r>
     </w:p>
     <w:p>
-      <w:pPr/>
       <w:r>
         <w:t>Every method collapses well below its Dataset A TEST score zero-shot (M1: 0.7403→0.3563; M6: 0.8209→0.4724) - but per the Task A/B distinction above, this is not a detection failure: the dominant error mode is misclassifying sincere SIGN interpretations as sarcastic (M1 flags 71.2% of them; M2, the worst offender, flags 76.5%), not missing the sarcastic originals. M6 is the strongest zero-transfer method on Task B despite being the weakest on Task A - a direct illustration of why the two tasks must be reported separately.</w:t>
       </w:r>
@@ -16065,12 +16008,14 @@
       <w:pPr>
         <w:pStyle w:val="Heading2"/>
       </w:pPr>
-      <w:r>
+      <w:bookmarkStart w:id="43" w:name="_Toc238317450"/>
+      <w:r>
+        <w:lastRenderedPageBreak/>
         <w:t>4.3 Primary Human Reference Evaluation</w:t>
       </w:r>
-    </w:p>
-    <w:p>
-      <w:pPr/>
+      <w:bookmarkEnd w:id="43"/>
+    </w:p>
+    <w:p>
       <w:r>
         <w:t>Interpretation #1 (first-listed per SIGN family) is treated as the primary/best human reference - a provenance decision, tested rather than assumed to also be the linguistically easiest case (§4.4).</w:t>
       </w:r>
@@ -16078,8 +16023,8 @@
     <w:tbl>
       <w:tblPr>
         <w:tblStyle w:val="TableGrid"/>
-        <w:tblW w:type="auto" w:w="0"/>
-        <w:tblLook w:firstColumn="1" w:firstRow="1" w:lastColumn="0" w:lastRow="0" w:noHBand="0" w:noVBand="1" w:val="04A0"/>
+        <w:tblW w:w="0" w:type="auto"/>
+        <w:tblLook w:val="04A0" w:firstRow="1" w:lastRow="0" w:firstColumn="1" w:lastColumn="0" w:noHBand="0" w:noVBand="1"/>
       </w:tblPr>
       <w:tblGrid>
         <w:gridCol w:w="3173"/>
@@ -16089,7 +16034,7 @@
       <w:tr>
         <w:tc>
           <w:tcPr>
-            <w:tcW w:type="dxa" w:w="3173"/>
+            <w:tcW w:w="3173" w:type="dxa"/>
           </w:tcPr>
           <w:p>
             <w:r>
@@ -16102,7 +16047,7 @@
         </w:tc>
         <w:tc>
           <w:tcPr>
-            <w:tcW w:type="dxa" w:w="3173"/>
+            <w:tcW w:w="3173" w:type="dxa"/>
           </w:tcPr>
           <w:p>
             <w:r>
@@ -16115,7 +16060,7 @@
         </w:tc>
         <w:tc>
           <w:tcPr>
-            <w:tcW w:type="dxa" w:w="3173"/>
+            <w:tcW w:w="3173" w:type="dxa"/>
           </w:tcPr>
           <w:p>
             <w:r>
@@ -16130,7 +16075,7 @@
       <w:tr>
         <w:tc>
           <w:tcPr>
-            <w:tcW w:type="dxa" w:w="3173"/>
+            <w:tcW w:w="3173" w:type="dxa"/>
           </w:tcPr>
           <w:p>
             <w:r>
@@ -16140,7 +16085,7 @@
         </w:tc>
         <w:tc>
           <w:tcPr>
-            <w:tcW w:type="dxa" w:w="3173"/>
+            <w:tcW w:w="3173" w:type="dxa"/>
           </w:tcPr>
           <w:p>
             <w:r>
@@ -16150,7 +16095,7 @@
         </w:tc>
         <w:tc>
           <w:tcPr>
-            <w:tcW w:type="dxa" w:w="3173"/>
+            <w:tcW w:w="3173" w:type="dxa"/>
           </w:tcPr>
           <w:p>
             <w:r>
@@ -16162,7 +16107,7 @@
       <w:tr>
         <w:tc>
           <w:tcPr>
-            <w:tcW w:type="dxa" w:w="3173"/>
+            <w:tcW w:w="3173" w:type="dxa"/>
           </w:tcPr>
           <w:p>
             <w:r>
@@ -16172,7 +16117,7 @@
         </w:tc>
         <w:tc>
           <w:tcPr>
-            <w:tcW w:type="dxa" w:w="3173"/>
+            <w:tcW w:w="3173" w:type="dxa"/>
           </w:tcPr>
           <w:p>
             <w:r>
@@ -16182,7 +16127,7 @@
         </w:tc>
         <w:tc>
           <w:tcPr>
-            <w:tcW w:type="dxa" w:w="3173"/>
+            <w:tcW w:w="3173" w:type="dxa"/>
           </w:tcPr>
           <w:p>
             <w:r>
@@ -16194,7 +16139,7 @@
       <w:tr>
         <w:tc>
           <w:tcPr>
-            <w:tcW w:type="dxa" w:w="3173"/>
+            <w:tcW w:w="3173" w:type="dxa"/>
           </w:tcPr>
           <w:p>
             <w:r>
@@ -16204,7 +16149,7 @@
         </w:tc>
         <w:tc>
           <w:tcPr>
-            <w:tcW w:type="dxa" w:w="3173"/>
+            <w:tcW w:w="3173" w:type="dxa"/>
           </w:tcPr>
           <w:p>
             <w:r>
@@ -16214,7 +16159,7 @@
         </w:tc>
         <w:tc>
           <w:tcPr>
-            <w:tcW w:type="dxa" w:w="3173"/>
+            <w:tcW w:w="3173" w:type="dxa"/>
           </w:tcPr>
           <w:p>
             <w:r>
@@ -16226,7 +16171,7 @@
       <w:tr>
         <w:tc>
           <w:tcPr>
-            <w:tcW w:type="dxa" w:w="3173"/>
+            <w:tcW w:w="3173" w:type="dxa"/>
           </w:tcPr>
           <w:p>
             <w:r>
@@ -16236,7 +16181,7 @@
         </w:tc>
         <w:tc>
           <w:tcPr>
-            <w:tcW w:type="dxa" w:w="3173"/>
+            <w:tcW w:w="3173" w:type="dxa"/>
           </w:tcPr>
           <w:p>
             <w:r>
@@ -16246,7 +16191,7 @@
         </w:tc>
         <w:tc>
           <w:tcPr>
-            <w:tcW w:type="dxa" w:w="3173"/>
+            <w:tcW w:w="3173" w:type="dxa"/>
           </w:tcPr>
           <w:p>
             <w:r>
@@ -16258,7 +16203,7 @@
       <w:tr>
         <w:tc>
           <w:tcPr>
-            <w:tcW w:type="dxa" w:w="3173"/>
+            <w:tcW w:w="3173" w:type="dxa"/>
           </w:tcPr>
           <w:p>
             <w:r>
@@ -16268,7 +16213,7 @@
         </w:tc>
         <w:tc>
           <w:tcPr>
-            <w:tcW w:type="dxa" w:w="3173"/>
+            <w:tcW w:w="3173" w:type="dxa"/>
           </w:tcPr>
           <w:p>
             <w:r>
@@ -16278,7 +16223,7 @@
         </w:tc>
         <w:tc>
           <w:tcPr>
-            <w:tcW w:type="dxa" w:w="3173"/>
+            <w:tcW w:w="3173" w:type="dxa"/>
           </w:tcPr>
           <w:p>
             <w:r>
@@ -16290,7 +16235,7 @@
       <w:tr>
         <w:tc>
           <w:tcPr>
-            <w:tcW w:type="dxa" w:w="3173"/>
+            <w:tcW w:w="3173" w:type="dxa"/>
           </w:tcPr>
           <w:p>
             <w:r>
@@ -16300,7 +16245,7 @@
         </w:tc>
         <w:tc>
           <w:tcPr>
-            <w:tcW w:type="dxa" w:w="3173"/>
+            <w:tcW w:w="3173" w:type="dxa"/>
           </w:tcPr>
           <w:p>
             <w:r>
@@ -16310,7 +16255,7 @@
         </w:tc>
         <w:tc>
           <w:tcPr>
-            <w:tcW w:type="dxa" w:w="3173"/>
+            <w:tcW w:w="3173" w:type="dxa"/>
           </w:tcPr>
           <w:p>
             <w:r>
@@ -16321,13 +16266,11 @@
       </w:tr>
     </w:tbl>
     <w:p>
-      <w:pPr/>
       <w:r>
         <w:t>Table 12. Original vs. primary (interpretation #1) reference only.</w:t>
       </w:r>
     </w:p>
     <w:p>
-      <w:pPr/>
       <w:r>
         <w:t>Restricting to the single primary interpretation is substantially easier than the full contrastive set for every method (e.g. M1: 0.356→0.517 Macro F1; M6: 0.472→0.566) - but pair success (getting both the original and its primary interpretation right, same family) still tops out at 26.8%, so even the cleanest single-pair case remains hard in absolute terms.</w:t>
       </w:r>
@@ -16336,15 +16279,17 @@
       <w:pPr>
         <w:pStyle w:val="Heading2"/>
       </w:pPr>
+      <w:bookmarkStart w:id="44" w:name="_Toc238317451"/>
       <w:r>
         <w:t>4.4 Full Family Evaluation</w:t>
       </w:r>
+      <w:bookmarkEnd w:id="44"/>
     </w:p>
     <w:tbl>
       <w:tblPr>
         <w:tblStyle w:val="TableGrid"/>
-        <w:tblW w:type="auto" w:w="0"/>
-        <w:tblLook w:firstColumn="1" w:firstRow="1" w:lastColumn="0" w:lastRow="0" w:noHBand="0" w:noVBand="1" w:val="04A0"/>
+        <w:tblW w:w="0" w:type="auto"/>
+        <w:tblLook w:val="04A0" w:firstRow="1" w:lastRow="0" w:firstColumn="1" w:lastColumn="0" w:noHBand="0" w:noVBand="1"/>
       </w:tblPr>
       <w:tblGrid>
         <w:gridCol w:w="3173"/>
@@ -16354,7 +16299,7 @@
       <w:tr>
         <w:tc>
           <w:tcPr>
-            <w:tcW w:type="dxa" w:w="3173"/>
+            <w:tcW w:w="3173" w:type="dxa"/>
           </w:tcPr>
           <w:p>
             <w:r>
@@ -16367,7 +16312,7 @@
         </w:tc>
         <w:tc>
           <w:tcPr>
-            <w:tcW w:type="dxa" w:w="3173"/>
+            <w:tcW w:w="3173" w:type="dxa"/>
           </w:tcPr>
           <w:p>
             <w:r>
@@ -16380,7 +16325,7 @@
         </w:tc>
         <w:tc>
           <w:tcPr>
-            <w:tcW w:type="dxa" w:w="3173"/>
+            <w:tcW w:w="3173" w:type="dxa"/>
           </w:tcPr>
           <w:p>
             <w:r>
@@ -16395,7 +16340,7 @@
       <w:tr>
         <w:tc>
           <w:tcPr>
-            <w:tcW w:type="dxa" w:w="3173"/>
+            <w:tcW w:w="3173" w:type="dxa"/>
           </w:tcPr>
           <w:p>
             <w:r>
@@ -16405,7 +16350,7 @@
         </w:tc>
         <w:tc>
           <w:tcPr>
-            <w:tcW w:type="dxa" w:w="3173"/>
+            <w:tcW w:w="3173" w:type="dxa"/>
           </w:tcPr>
           <w:p>
             <w:r>
@@ -16415,7 +16360,7 @@
         </w:tc>
         <w:tc>
           <w:tcPr>
-            <w:tcW w:type="dxa" w:w="3173"/>
+            <w:tcW w:w="3173" w:type="dxa"/>
           </w:tcPr>
           <w:p>
             <w:r>
@@ -16427,7 +16372,7 @@
       <w:tr>
         <w:tc>
           <w:tcPr>
-            <w:tcW w:type="dxa" w:w="3173"/>
+            <w:tcW w:w="3173" w:type="dxa"/>
           </w:tcPr>
           <w:p>
             <w:r>
@@ -16437,7 +16382,7 @@
         </w:tc>
         <w:tc>
           <w:tcPr>
-            <w:tcW w:type="dxa" w:w="3173"/>
+            <w:tcW w:w="3173" w:type="dxa"/>
           </w:tcPr>
           <w:p>
             <w:r>
@@ -16447,7 +16392,7 @@
         </w:tc>
         <w:tc>
           <w:tcPr>
-            <w:tcW w:type="dxa" w:w="3173"/>
+            <w:tcW w:w="3173" w:type="dxa"/>
           </w:tcPr>
           <w:p>
             <w:r>
@@ -16459,7 +16404,7 @@
       <w:tr>
         <w:tc>
           <w:tcPr>
-            <w:tcW w:type="dxa" w:w="3173"/>
+            <w:tcW w:w="3173" w:type="dxa"/>
           </w:tcPr>
           <w:p>
             <w:r>
@@ -16469,7 +16414,7 @@
         </w:tc>
         <w:tc>
           <w:tcPr>
-            <w:tcW w:type="dxa" w:w="3173"/>
+            <w:tcW w:w="3173" w:type="dxa"/>
           </w:tcPr>
           <w:p>
             <w:r>
@@ -16479,7 +16424,7 @@
         </w:tc>
         <w:tc>
           <w:tcPr>
-            <w:tcW w:type="dxa" w:w="3173"/>
+            <w:tcW w:w="3173" w:type="dxa"/>
           </w:tcPr>
           <w:p>
             <w:r>
@@ -16491,7 +16436,7 @@
       <w:tr>
         <w:tc>
           <w:tcPr>
-            <w:tcW w:type="dxa" w:w="3173"/>
+            <w:tcW w:w="3173" w:type="dxa"/>
           </w:tcPr>
           <w:p>
             <w:r>
@@ -16501,7 +16446,7 @@
         </w:tc>
         <w:tc>
           <w:tcPr>
-            <w:tcW w:type="dxa" w:w="3173"/>
+            <w:tcW w:w="3173" w:type="dxa"/>
           </w:tcPr>
           <w:p>
             <w:r>
@@ -16511,7 +16456,7 @@
         </w:tc>
         <w:tc>
           <w:tcPr>
-            <w:tcW w:type="dxa" w:w="3173"/>
+            <w:tcW w:w="3173" w:type="dxa"/>
           </w:tcPr>
           <w:p>
             <w:r>
@@ -16523,7 +16468,7 @@
       <w:tr>
         <w:tc>
           <w:tcPr>
-            <w:tcW w:type="dxa" w:w="3173"/>
+            <w:tcW w:w="3173" w:type="dxa"/>
           </w:tcPr>
           <w:p>
             <w:r>
@@ -16533,7 +16478,7 @@
         </w:tc>
         <w:tc>
           <w:tcPr>
-            <w:tcW w:type="dxa" w:w="3173"/>
+            <w:tcW w:w="3173" w:type="dxa"/>
           </w:tcPr>
           <w:p>
             <w:r>
@@ -16543,7 +16488,7 @@
         </w:tc>
         <w:tc>
           <w:tcPr>
-            <w:tcW w:type="dxa" w:w="3173"/>
+            <w:tcW w:w="3173" w:type="dxa"/>
           </w:tcPr>
           <w:p>
             <w:r>
@@ -16555,7 +16500,7 @@
       <w:tr>
         <w:tc>
           <w:tcPr>
-            <w:tcW w:type="dxa" w:w="3173"/>
+            <w:tcW w:w="3173" w:type="dxa"/>
           </w:tcPr>
           <w:p>
             <w:r>
@@ -16565,7 +16510,7 @@
         </w:tc>
         <w:tc>
           <w:tcPr>
-            <w:tcW w:type="dxa" w:w="3173"/>
+            <w:tcW w:w="3173" w:type="dxa"/>
           </w:tcPr>
           <w:p>
             <w:r>
@@ -16575,7 +16520,7 @@
         </w:tc>
         <w:tc>
           <w:tcPr>
-            <w:tcW w:type="dxa" w:w="3173"/>
+            <w:tcW w:w="3173" w:type="dxa"/>
           </w:tcPr>
           <w:p>
             <w:r>
@@ -16586,33 +16531,35 @@
       </w:tr>
     </w:tbl>
     <w:p>
-      <w:pPr/>
       <w:r>
         <w:t>Table 13. Original plus all five interpretations, per family.</w:t>
       </w:r>
     </w:p>
     <w:p>
-      <w:pPr/>
-      <w:r>
-        <w:t>Getting an entire family exactly right (the original plus all five interpretations) is essentially unsolved for every method (0-3.8%) - the gap between this and §4.3's pair-success rate is the clearest illustration of Task B's real difficulty: one interpretation right per family is plausible, all five simultaneously is not. Per-interpretation-rank recall was tested, not assumed, and does not show a clean “rank #1 is easiest” pattern - M6's not-sarcastic recall by rank is 49.8% / 54.7% / 39.6% / 60.4% / 53.2% (#1→#5), non-monotonic; most methods peak at rank #4, not #1. Interpretation #1 being the “primary reference” is a provenance/quality claim (first-listed = best annotation), not a claim that it is linguistically the easiest case for a model.</w:t>
+      <w:r>
+        <w:t>Getting an entire family exactly right (the original plus all five interpretations) is essentially unsolved for every method (0-3.8%) - the gap between this and §4.3's pair-success rate is the clearest illustration of Task B's real difficulty: one interpretation right per family is plausible, all five simultaneously is not. Per-</w:t>
+      </w:r>
+      <w:r>
+        <w:lastRenderedPageBreak/>
+        <w:t>interpretation-rank recall was tested, not assumed, and does not show a clean “rank #1 is easiest” pattern - M6's not-sarcastic recall by rank is 49.8% / 54.7% / 39.6% / 60.4% / 53.2% (#1→#5), non-monotonic; most methods peak at rank #4, not #1. Interpretation #1 being the “primary reference” is a provenance/quality claim (first-listed = best annotation), not a claim that it is linguistically the easiest case for a model.</w:t>
       </w:r>
     </w:p>
     <w:p>
       <w:pPr>
         <w:pStyle w:val="Heading2"/>
       </w:pPr>
+      <w:bookmarkStart w:id="45" w:name="_Toc238317452"/>
       <w:r>
         <w:t>4.5 What Kinds of SIGN Sarcasm Do the Models Fail to Detect?</w:t>
       </w:r>
-    </w:p>
-    <w:p>
-      <w:pPr/>
+      <w:bookmarkEnd w:id="45"/>
+    </w:p>
+    <w:p>
       <w:r>
         <w:t>This section and the next report the outcome of a manual review pass conducted directly on the predictions once all six methods had been run zero-transfer on SIGN for the first time (Section 4.1's results). Rather than trusting the aggregate Task A/Task B metrics alone, every prediction file was joined against the underlying SIGN text and read case by case: every original ever missed by at least one method (148 of 265), every interpretation ever flagged sarcastic by at least one method (1,400 of 1,470), and in particular the subset every method agreed on -- both the 117 universally-detected originals and the 427 interpretations every method flagged as sarcastic. This direct, row-by-row reading is what surfaced the section 4.6 finding that a real fraction of the "universally wrong" interpretations are byte-identical to their own sarcastic original -- a data-quality property no aggregate metric would have revealed on its own, since it only becomes visible once a human actually opens the flagged rows and compares them against the source text. The qualitative patterns in this section (polarity-reversal irony vs. world-knowledge-dependent cases) came from the same close reading of the universally-easy and universally-hard subsets, not from an automated classifier of difficulty.</w:t>
       </w:r>
     </w:p>
     <w:p>
-      <w:pPr/>
       <w:r>
         <w:t>A complete pass over every Task A miss across all six methods (148 of 265 originals missed by at least one method, not a sample) finds that of the measurable text properties tested, only length shows even a modest contrast: ever-missed originals average 13.4 words vs. 14.8 for always-detected ones. Question marks are more common among always-detected originals (17.1%) than ever-missed ones (13.5%) - contradicting a naive “rhetorical questions are harder” hypothesis. VADER sentiment is nearly identical between groups (0.237 vs. 0.223) - surface polarity alone does not predict what gets missed. Qualitatively, the 117 of 265 originals every method detects cluster around classic polarity-reversal verbal irony (strongly positive words applied to clearly negative topics, “don't you just love...” constructions) - idiomatic markers that transfer well from Dataset A. The hardest non-duplicate cases tend toward flat, factual-sounding statements whose sarcasm depends on outside world knowledge not recoverable from the text alone - a context-dependence limitation no amount of in-domain fine-tuning on text alone can fully close.</w:t>
       </w:r>
@@ -16621,26 +16568,32 @@
       <w:pPr>
         <w:pStyle w:val="Heading2"/>
       </w:pPr>
+      <w:bookmarkStart w:id="46" w:name="_Toc238317453"/>
       <w:r>
         <w:t>4.6 Why Are Sincere SIGN Interpretations Misclassified as Sarcastic?</w:t>
       </w:r>
-    </w:p>
-    <w:p>
-      <w:pPr/>
-      <w:r>
-        <w:t>A real fraction of SIGN's “sincere interpretations” are byte-identical to their own sarcastic original - an irreducible label contradiction, discovered by direct inspection, not assumed. 28.1% of the 427 interpretations flagged sarcastic by every method are exact duplicates of their original; both SIGN Test originals missed by all six methods share this property. This means a real share of Task B's apparent difficulty is a data-quality ceiling no model can cross, not purely a modeling gap - disclosed here as a limitation rather than filtered out of the training data. Separately, cross-model overlap analysis shows two distinct failure clusters rather than one shared hard subset: the three Qwen-prompted methods (M2/M3/M4, same base model) miss heavily overlapping originals (pairwise Jaccard 0.50-0.67), while M1 and M6 each fail in their own largely distinct pattern (M1-M6 Jaccard 0.22, M1-M2 0.04) - a candidate signal that M1/M6 would be the more complementary pairing for any future ensembling, not yet tested.</w:t>
+      <w:bookmarkEnd w:id="46"/>
+    </w:p>
+    <w:p>
+      <w:r>
+        <w:t xml:space="preserve">A real fraction of SIGN's “sincere interpretations” are byte-identical to their own sarcastic original - an irreducible label contradiction, discovered by direct inspection, not assumed. 28.1% of the 427 </w:t>
+      </w:r>
+      <w:r>
+        <w:lastRenderedPageBreak/>
+        <w:t>interpretations flagged sarcastic by every method are exact duplicates of their original; both SIGN Test originals missed by all six methods share this property. This means a real share of Task B's apparent difficulty is a data-quality ceiling no model can cross, not purely a modeling gap - disclosed here as a limitation rather than filtered out of the training data. Separately, cross-model overlap analysis shows two distinct failure clusters rather than one shared hard subset: the three Qwen-prompted methods (M2/M3/M4, same base model) miss heavily overlapping originals (pairwise Jaccard 0.50-0.67), while M1 and M6 each fail in their own largely distinct pattern (M1-M6 Jaccard 0.22, M1-M2 0.04) - a candidate signal that M1/M6 would be the more complementary pairing for any future ensembling, not yet tested.</w:t>
       </w:r>
     </w:p>
     <w:p>
       <w:pPr>
         <w:pStyle w:val="Heading2"/>
       </w:pPr>
+      <w:bookmarkStart w:id="47" w:name="_Toc238317454"/>
       <w:r>
         <w:t>4.7 Effect of SIGN Domain Adaptation</w:t>
       </w:r>
-    </w:p>
-    <w:p>
-      <w:pPr/>
+      <w:bookmarkEnd w:id="47"/>
+    </w:p>
+    <w:p>
       <w:r>
         <w:t>Three conditions compared for M1 and M6: A = Dataset A only (zero-transfer, reused); B = Dataset A TRAIN + SIGN Train, combined fit; C = SIGN Train only.</w:t>
       </w:r>
@@ -16648,8 +16601,8 @@
     <w:tbl>
       <w:tblPr>
         <w:tblStyle w:val="TableGrid"/>
-        <w:tblW w:type="auto" w:w="0"/>
-        <w:tblLook w:firstColumn="1" w:firstRow="1" w:lastColumn="0" w:lastRow="0" w:noHBand="0" w:noVBand="1" w:val="04A0"/>
+        <w:tblW w:w="0" w:type="auto"/>
+        <w:tblLook w:val="04A0" w:firstRow="1" w:lastRow="0" w:firstColumn="1" w:lastColumn="0" w:noHBand="0" w:noVBand="1"/>
       </w:tblPr>
       <w:tblGrid>
         <w:gridCol w:w="2379"/>
@@ -16660,7 +16613,7 @@
       <w:tr>
         <w:tc>
           <w:tcPr>
-            <w:tcW w:type="dxa" w:w="2379"/>
+            <w:tcW w:w="2379" w:type="dxa"/>
           </w:tcPr>
           <w:p>
             <w:r>
@@ -16673,7 +16626,7 @@
         </w:tc>
         <w:tc>
           <w:tcPr>
-            <w:tcW w:type="dxa" w:w="2379"/>
+            <w:tcW w:w="2379" w:type="dxa"/>
           </w:tcPr>
           <w:p>
             <w:r>
@@ -16686,7 +16639,7 @@
         </w:tc>
         <w:tc>
           <w:tcPr>
-            <w:tcW w:type="dxa" w:w="2379"/>
+            <w:tcW w:w="2379" w:type="dxa"/>
           </w:tcPr>
           <w:p>
             <w:r>
@@ -16699,7 +16652,7 @@
         </w:tc>
         <w:tc>
           <w:tcPr>
-            <w:tcW w:type="dxa" w:w="2379"/>
+            <w:tcW w:w="2379" w:type="dxa"/>
           </w:tcPr>
           <w:p>
             <w:r>
@@ -16714,7 +16667,7 @@
       <w:tr>
         <w:tc>
           <w:tcPr>
-            <w:tcW w:type="dxa" w:w="2379"/>
+            <w:tcW w:w="2379" w:type="dxa"/>
           </w:tcPr>
           <w:p>
             <w:r>
@@ -16724,7 +16677,7 @@
         </w:tc>
         <w:tc>
           <w:tcPr>
-            <w:tcW w:type="dxa" w:w="2379"/>
+            <w:tcW w:w="2379" w:type="dxa"/>
           </w:tcPr>
           <w:p>
             <w:r>
@@ -16734,7 +16687,7 @@
         </w:tc>
         <w:tc>
           <w:tcPr>
-            <w:tcW w:type="dxa" w:w="2379"/>
+            <w:tcW w:w="2379" w:type="dxa"/>
           </w:tcPr>
           <w:p>
             <w:r>
@@ -16744,7 +16697,7 @@
         </w:tc>
         <w:tc>
           <w:tcPr>
-            <w:tcW w:type="dxa" w:w="2379"/>
+            <w:tcW w:w="2379" w:type="dxa"/>
           </w:tcPr>
           <w:p>
             <w:r>
@@ -16756,7 +16709,7 @@
       <w:tr>
         <w:tc>
           <w:tcPr>
-            <w:tcW w:type="dxa" w:w="2379"/>
+            <w:tcW w:w="2379" w:type="dxa"/>
           </w:tcPr>
           <w:p>
             <w:r>
@@ -16766,7 +16719,7 @@
         </w:tc>
         <w:tc>
           <w:tcPr>
-            <w:tcW w:type="dxa" w:w="2379"/>
+            <w:tcW w:w="2379" w:type="dxa"/>
           </w:tcPr>
           <w:p>
             <w:r>
@@ -16776,7 +16729,7 @@
         </w:tc>
         <w:tc>
           <w:tcPr>
-            <w:tcW w:type="dxa" w:w="2379"/>
+            <w:tcW w:w="2379" w:type="dxa"/>
           </w:tcPr>
           <w:p>
             <w:r>
@@ -16786,7 +16739,7 @@
         </w:tc>
         <w:tc>
           <w:tcPr>
-            <w:tcW w:type="dxa" w:w="2379"/>
+            <w:tcW w:w="2379" w:type="dxa"/>
           </w:tcPr>
           <w:p>
             <w:r>
@@ -16798,7 +16751,7 @@
       <w:tr>
         <w:tc>
           <w:tcPr>
-            <w:tcW w:type="dxa" w:w="2379"/>
+            <w:tcW w:w="2379" w:type="dxa"/>
           </w:tcPr>
           <w:p>
             <w:r>
@@ -16808,7 +16761,7 @@
         </w:tc>
         <w:tc>
           <w:tcPr>
-            <w:tcW w:type="dxa" w:w="2379"/>
+            <w:tcW w:w="2379" w:type="dxa"/>
           </w:tcPr>
           <w:p>
             <w:r>
@@ -16818,7 +16771,7 @@
         </w:tc>
         <w:tc>
           <w:tcPr>
-            <w:tcW w:type="dxa" w:w="2379"/>
+            <w:tcW w:w="2379" w:type="dxa"/>
           </w:tcPr>
           <w:p>
             <w:r>
@@ -16828,7 +16781,7 @@
         </w:tc>
         <w:tc>
           <w:tcPr>
-            <w:tcW w:type="dxa" w:w="2379"/>
+            <w:tcW w:w="2379" w:type="dxa"/>
           </w:tcPr>
           <w:p>
             <w:r>
@@ -16840,7 +16793,7 @@
       <w:tr>
         <w:tc>
           <w:tcPr>
-            <w:tcW w:type="dxa" w:w="2379"/>
+            <w:tcW w:w="2379" w:type="dxa"/>
           </w:tcPr>
           <w:p>
             <w:r>
@@ -16850,7 +16803,7 @@
         </w:tc>
         <w:tc>
           <w:tcPr>
-            <w:tcW w:type="dxa" w:w="2379"/>
+            <w:tcW w:w="2379" w:type="dxa"/>
           </w:tcPr>
           <w:p>
             <w:r>
@@ -16860,7 +16813,7 @@
         </w:tc>
         <w:tc>
           <w:tcPr>
-            <w:tcW w:type="dxa" w:w="2379"/>
+            <w:tcW w:w="2379" w:type="dxa"/>
           </w:tcPr>
           <w:p>
             <w:r>
@@ -16870,7 +16823,7 @@
         </w:tc>
         <w:tc>
           <w:tcPr>
-            <w:tcW w:type="dxa" w:w="2379"/>
+            <w:tcW w:w="2379" w:type="dxa"/>
           </w:tcPr>
           <w:p>
             <w:r>
@@ -16882,7 +16835,7 @@
       <w:tr>
         <w:tc>
           <w:tcPr>
-            <w:tcW w:type="dxa" w:w="2379"/>
+            <w:tcW w:w="2379" w:type="dxa"/>
           </w:tcPr>
           <w:p>
             <w:r>
@@ -16892,7 +16845,7 @@
         </w:tc>
         <w:tc>
           <w:tcPr>
-            <w:tcW w:type="dxa" w:w="2379"/>
+            <w:tcW w:w="2379" w:type="dxa"/>
           </w:tcPr>
           <w:p>
             <w:r>
@@ -16902,7 +16855,7 @@
         </w:tc>
         <w:tc>
           <w:tcPr>
-            <w:tcW w:type="dxa" w:w="2379"/>
+            <w:tcW w:w="2379" w:type="dxa"/>
           </w:tcPr>
           <w:p>
             <w:r>
@@ -16912,7 +16865,7 @@
         </w:tc>
         <w:tc>
           <w:tcPr>
-            <w:tcW w:type="dxa" w:w="2379"/>
+            <w:tcW w:w="2379" w:type="dxa"/>
           </w:tcPr>
           <w:p>
             <w:r>
@@ -16924,7 +16877,7 @@
       <w:tr>
         <w:tc>
           <w:tcPr>
-            <w:tcW w:type="dxa" w:w="2379"/>
+            <w:tcW w:w="2379" w:type="dxa"/>
           </w:tcPr>
           <w:p>
             <w:r>
@@ -16934,7 +16887,7 @@
         </w:tc>
         <w:tc>
           <w:tcPr>
-            <w:tcW w:type="dxa" w:w="2379"/>
+            <w:tcW w:w="2379" w:type="dxa"/>
           </w:tcPr>
           <w:p>
             <w:r>
@@ -16944,7 +16897,7 @@
         </w:tc>
         <w:tc>
           <w:tcPr>
-            <w:tcW w:type="dxa" w:w="2379"/>
+            <w:tcW w:w="2379" w:type="dxa"/>
           </w:tcPr>
           <w:p>
             <w:r>
@@ -16954,7 +16907,7 @@
         </w:tc>
         <w:tc>
           <w:tcPr>
-            <w:tcW w:type="dxa" w:w="2379"/>
+            <w:tcW w:w="2379" w:type="dxa"/>
           </w:tcPr>
           <w:p>
             <w:r>
@@ -16965,13 +16918,11 @@
       </w:tr>
     </w:tbl>
     <w:p>
-      <w:pPr/>
       <w:r>
         <w:t>Table 14. Domain adaptation conditions, both models, dual-target evaluation.</w:t>
       </w:r>
     </w:p>
     <w:p>
-      <w:pPr/>
       <w:r>
         <w:t>Combining SIGN Train with Dataset A (condition B) captures almost all of SIGN-only training's improvement while fully avoiding the catastrophic forgetting condition C causes on both models - the clean answer for how to adapt without sacrificing the original task. A genuine model-capacity contrast emerged in the before/after error diff: M1's adaptation traded a little Task A recall for a large Task B gain (79.6%→74.7% detection rate); M6's adaptation improved both Task A and Task B simultaneously, with no such trade-off.</w:t>
       </w:r>
@@ -16980,15 +16931,17 @@
       <w:pPr>
         <w:pStyle w:val="Heading2"/>
       </w:pPr>
+      <w:bookmarkStart w:id="48" w:name="_Toc238317455"/>
       <w:r>
         <w:t>4.8 Effect of the Amount of SIGN Training Data</w:t>
       </w:r>
+      <w:bookmarkEnd w:id="48"/>
     </w:p>
     <w:tbl>
       <w:tblPr>
         <w:tblStyle w:val="TableGrid"/>
-        <w:tblW w:type="auto" w:w="0"/>
-        <w:tblLook w:firstColumn="1" w:firstRow="1" w:lastColumn="0" w:lastRow="0" w:noHBand="0" w:noVBand="1" w:val="04A0"/>
+        <w:tblW w:w="0" w:type="auto"/>
+        <w:tblLook w:val="04A0" w:firstRow="1" w:lastRow="0" w:firstColumn="1" w:lastColumn="0" w:noHBand="0" w:noVBand="1"/>
       </w:tblPr>
       <w:tblGrid>
         <w:gridCol w:w="1904"/>
@@ -17000,7 +16953,7 @@
       <w:tr>
         <w:tc>
           <w:tcPr>
-            <w:tcW w:type="dxa" w:w="1904"/>
+            <w:tcW w:w="1904" w:type="dxa"/>
           </w:tcPr>
           <w:p>
             <w:r>
@@ -17013,7 +16966,7 @@
         </w:tc>
         <w:tc>
           <w:tcPr>
-            <w:tcW w:type="dxa" w:w="1904"/>
+            <w:tcW w:w="1904" w:type="dxa"/>
           </w:tcPr>
           <w:p>
             <w:r>
@@ -17026,7 +16979,7 @@
         </w:tc>
         <w:tc>
           <w:tcPr>
-            <w:tcW w:type="dxa" w:w="1904"/>
+            <w:tcW w:w="1904" w:type="dxa"/>
           </w:tcPr>
           <w:p>
             <w:r>
@@ -17039,7 +16992,7 @@
         </w:tc>
         <w:tc>
           <w:tcPr>
-            <w:tcW w:type="dxa" w:w="1904"/>
+            <w:tcW w:w="1904" w:type="dxa"/>
           </w:tcPr>
           <w:p>
             <w:r>
@@ -17052,7 +17005,7 @@
         </w:tc>
         <w:tc>
           <w:tcPr>
-            <w:tcW w:type="dxa" w:w="1904"/>
+            <w:tcW w:w="1904" w:type="dxa"/>
           </w:tcPr>
           <w:p>
             <w:r>
@@ -17067,17 +17020,18 @@
       <w:tr>
         <w:tc>
           <w:tcPr>
-            <w:tcW w:type="dxa" w:w="1904"/>
-          </w:tcPr>
-          <w:p>
-            <w:r>
+            <w:tcW w:w="1904" w:type="dxa"/>
+          </w:tcPr>
+          <w:p>
+            <w:r>
+              <w:lastRenderedPageBreak/>
               <w:t>0%</w:t>
             </w:r>
           </w:p>
         </w:tc>
         <w:tc>
           <w:tcPr>
-            <w:tcW w:type="dxa" w:w="1904"/>
+            <w:tcW w:w="1904" w:type="dxa"/>
           </w:tcPr>
           <w:p>
             <w:r>
@@ -17087,7 +17041,7 @@
         </w:tc>
         <w:tc>
           <w:tcPr>
-            <w:tcW w:type="dxa" w:w="1904"/>
+            <w:tcW w:w="1904" w:type="dxa"/>
           </w:tcPr>
           <w:p>
             <w:r>
@@ -17097,7 +17051,7 @@
         </w:tc>
         <w:tc>
           <w:tcPr>
-            <w:tcW w:type="dxa" w:w="1904"/>
+            <w:tcW w:w="1904" w:type="dxa"/>
           </w:tcPr>
           <w:p>
             <w:r>
@@ -17107,7 +17061,7 @@
         </w:tc>
         <w:tc>
           <w:tcPr>
-            <w:tcW w:type="dxa" w:w="1904"/>
+            <w:tcW w:w="1904" w:type="dxa"/>
           </w:tcPr>
           <w:p>
             <w:r>
@@ -17119,7 +17073,7 @@
       <w:tr>
         <w:tc>
           <w:tcPr>
-            <w:tcW w:type="dxa" w:w="1904"/>
+            <w:tcW w:w="1904" w:type="dxa"/>
           </w:tcPr>
           <w:p>
             <w:r>
@@ -17129,7 +17083,7 @@
         </w:tc>
         <w:tc>
           <w:tcPr>
-            <w:tcW w:type="dxa" w:w="1904"/>
+            <w:tcW w:w="1904" w:type="dxa"/>
           </w:tcPr>
           <w:p>
             <w:r>
@@ -17139,7 +17093,7 @@
         </w:tc>
         <w:tc>
           <w:tcPr>
-            <w:tcW w:type="dxa" w:w="1904"/>
+            <w:tcW w:w="1904" w:type="dxa"/>
           </w:tcPr>
           <w:p>
             <w:r>
@@ -17149,7 +17103,7 @@
         </w:tc>
         <w:tc>
           <w:tcPr>
-            <w:tcW w:type="dxa" w:w="1904"/>
+            <w:tcW w:w="1904" w:type="dxa"/>
           </w:tcPr>
           <w:p>
             <w:r>
@@ -17159,7 +17113,7 @@
         </w:tc>
         <w:tc>
           <w:tcPr>
-            <w:tcW w:type="dxa" w:w="1904"/>
+            <w:tcW w:w="1904" w:type="dxa"/>
           </w:tcPr>
           <w:p>
             <w:r>
@@ -17171,7 +17125,7 @@
       <w:tr>
         <w:tc>
           <w:tcPr>
-            <w:tcW w:type="dxa" w:w="1904"/>
+            <w:tcW w:w="1904" w:type="dxa"/>
           </w:tcPr>
           <w:p>
             <w:r>
@@ -17181,7 +17135,7 @@
         </w:tc>
         <w:tc>
           <w:tcPr>
-            <w:tcW w:type="dxa" w:w="1904"/>
+            <w:tcW w:w="1904" w:type="dxa"/>
           </w:tcPr>
           <w:p>
             <w:r>
@@ -17191,7 +17145,7 @@
         </w:tc>
         <w:tc>
           <w:tcPr>
-            <w:tcW w:type="dxa" w:w="1904"/>
+            <w:tcW w:w="1904" w:type="dxa"/>
           </w:tcPr>
           <w:p>
             <w:r>
@@ -17201,7 +17155,7 @@
         </w:tc>
         <w:tc>
           <w:tcPr>
-            <w:tcW w:type="dxa" w:w="1904"/>
+            <w:tcW w:w="1904" w:type="dxa"/>
           </w:tcPr>
           <w:p>
             <w:r>
@@ -17211,7 +17165,7 @@
         </w:tc>
         <w:tc>
           <w:tcPr>
-            <w:tcW w:type="dxa" w:w="1904"/>
+            <w:tcW w:w="1904" w:type="dxa"/>
           </w:tcPr>
           <w:p>
             <w:r>
@@ -17223,7 +17177,7 @@
       <w:tr>
         <w:tc>
           <w:tcPr>
-            <w:tcW w:type="dxa" w:w="1904"/>
+            <w:tcW w:w="1904" w:type="dxa"/>
           </w:tcPr>
           <w:p>
             <w:r>
@@ -17233,7 +17187,7 @@
         </w:tc>
         <w:tc>
           <w:tcPr>
-            <w:tcW w:type="dxa" w:w="1904"/>
+            <w:tcW w:w="1904" w:type="dxa"/>
           </w:tcPr>
           <w:p>
             <w:r>
@@ -17243,7 +17197,7 @@
         </w:tc>
         <w:tc>
           <w:tcPr>
-            <w:tcW w:type="dxa" w:w="1904"/>
+            <w:tcW w:w="1904" w:type="dxa"/>
           </w:tcPr>
           <w:p>
             <w:r>
@@ -17253,7 +17207,7 @@
         </w:tc>
         <w:tc>
           <w:tcPr>
-            <w:tcW w:type="dxa" w:w="1904"/>
+            <w:tcW w:w="1904" w:type="dxa"/>
           </w:tcPr>
           <w:p>
             <w:r>
@@ -17263,7 +17217,7 @@
         </w:tc>
         <w:tc>
           <w:tcPr>
-            <w:tcW w:type="dxa" w:w="1904"/>
+            <w:tcW w:w="1904" w:type="dxa"/>
           </w:tcPr>
           <w:p>
             <w:r>
@@ -17275,7 +17229,7 @@
       <w:tr>
         <w:tc>
           <w:tcPr>
-            <w:tcW w:type="dxa" w:w="1904"/>
+            <w:tcW w:w="1904" w:type="dxa"/>
           </w:tcPr>
           <w:p>
             <w:r>
@@ -17285,7 +17239,7 @@
         </w:tc>
         <w:tc>
           <w:tcPr>
-            <w:tcW w:type="dxa" w:w="1904"/>
+            <w:tcW w:w="1904" w:type="dxa"/>
           </w:tcPr>
           <w:p>
             <w:r>
@@ -17295,7 +17249,7 @@
         </w:tc>
         <w:tc>
           <w:tcPr>
-            <w:tcW w:type="dxa" w:w="1904"/>
+            <w:tcW w:w="1904" w:type="dxa"/>
           </w:tcPr>
           <w:p>
             <w:r>
@@ -17305,7 +17259,7 @@
         </w:tc>
         <w:tc>
           <w:tcPr>
-            <w:tcW w:type="dxa" w:w="1904"/>
+            <w:tcW w:w="1904" w:type="dxa"/>
           </w:tcPr>
           <w:p>
             <w:r>
@@ -17315,7 +17269,7 @@
         </w:tc>
         <w:tc>
           <w:tcPr>
-            <w:tcW w:type="dxa" w:w="1904"/>
+            <w:tcW w:w="1904" w:type="dxa"/>
           </w:tcPr>
           <w:p>
             <w:r>
@@ -17327,7 +17281,7 @@
       <w:tr>
         <w:tc>
           <w:tcPr>
-            <w:tcW w:type="dxa" w:w="1904"/>
+            <w:tcW w:w="1904" w:type="dxa"/>
           </w:tcPr>
           <w:p>
             <w:r>
@@ -17337,7 +17291,7 @@
         </w:tc>
         <w:tc>
           <w:tcPr>
-            <w:tcW w:type="dxa" w:w="1904"/>
+            <w:tcW w:w="1904" w:type="dxa"/>
           </w:tcPr>
           <w:p>
             <w:r>
@@ -17347,7 +17301,7 @@
         </w:tc>
         <w:tc>
           <w:tcPr>
-            <w:tcW w:type="dxa" w:w="1904"/>
+            <w:tcW w:w="1904" w:type="dxa"/>
           </w:tcPr>
           <w:p>
             <w:r>
@@ -17357,7 +17311,7 @@
         </w:tc>
         <w:tc>
           <w:tcPr>
-            <w:tcW w:type="dxa" w:w="1904"/>
+            <w:tcW w:w="1904" w:type="dxa"/>
           </w:tcPr>
           <w:p>
             <w:r>
@@ -17367,7 +17321,7 @@
         </w:tc>
         <w:tc>
           <w:tcPr>
-            <w:tcW w:type="dxa" w:w="1904"/>
+            <w:tcW w:w="1904" w:type="dxa"/>
           </w:tcPr>
           <w:p>
             <w:r>
@@ -17378,13 +17332,11 @@
       </w:tr>
     </w:tbl>
     <w:p>
-      <w:pPr/>
       <w:r>
         <w:t>Table 15. Learning curve, condition B recipe, both models.</w:t>
       </w:r>
     </w:p>
     <w:p>
-      <w:pPr/>
       <w:r>
         <w:t>Most of the Task B gain arrives early for both models - the first 10-25% of SIGN Train covers over half the total 0%→100% improvement - a classic diminishing-returns learning curve. M1's Task A rate stays roughly flat across every nonzero fraction, never recovering to its zero-transfer level; M6's Task A rate climbs substantially with more SIGN exposure (63.8%→84.2% at 75%) - the opposite direction from M1, consistent with §4.7's model-capacity contrast. M6's curve shows some non-monotonic run-to-run variance in the 50-75% region, flagged as a limitation since no controls were run to separate sampling variance from fine-tuning-run variance at these fraction sizes.</w:t>
       </w:r>
@@ -17393,27 +17345,29 @@
       <w:pPr>
         <w:pStyle w:val="Heading2"/>
       </w:pPr>
+      <w:bookmarkStart w:id="49" w:name="_Toc238317456"/>
       <w:r>
         <w:t>4.9 Effect of the Number of Human Interpretations</w:t>
       </w:r>
+      <w:bookmarkEnd w:id="49"/>
     </w:p>
     <w:tbl>
       <w:tblPr>
         <w:tblStyle w:val="TableGrid"/>
-        <w:tblW w:type="auto" w:w="0"/>
-        <w:tblLook w:firstColumn="1" w:firstRow="1" w:lastColumn="0" w:lastRow="0" w:noHBand="0" w:noVBand="1" w:val="04A0"/>
+        <w:tblW w:w="0" w:type="auto"/>
+        <w:tblLook w:val="04A0" w:firstRow="1" w:lastRow="0" w:firstColumn="1" w:lastColumn="0" w:noHBand="0" w:noVBand="1"/>
       </w:tblPr>
       <w:tblGrid>
-        <w:gridCol w:w="1904"/>
-        <w:gridCol w:w="1904"/>
-        <w:gridCol w:w="1904"/>
-        <w:gridCol w:w="1904"/>
-        <w:gridCol w:w="1904"/>
+        <w:gridCol w:w="2401"/>
+        <w:gridCol w:w="1831"/>
+        <w:gridCol w:w="1835"/>
+        <w:gridCol w:w="1832"/>
+        <w:gridCol w:w="1835"/>
       </w:tblGrid>
       <w:tr>
         <w:tc>
           <w:tcPr>
-            <w:tcW w:type="dxa" w:w="1904"/>
+            <w:tcW w:w="1904" w:type="dxa"/>
           </w:tcPr>
           <w:p>
             <w:r>
@@ -17426,7 +17380,7 @@
         </w:tc>
         <w:tc>
           <w:tcPr>
-            <w:tcW w:type="dxa" w:w="1904"/>
+            <w:tcW w:w="1904" w:type="dxa"/>
           </w:tcPr>
           <w:p>
             <w:r>
@@ -17439,7 +17393,7 @@
         </w:tc>
         <w:tc>
           <w:tcPr>
-            <w:tcW w:type="dxa" w:w="1904"/>
+            <w:tcW w:w="1904" w:type="dxa"/>
           </w:tcPr>
           <w:p>
             <w:r>
@@ -17452,7 +17406,7 @@
         </w:tc>
         <w:tc>
           <w:tcPr>
-            <w:tcW w:type="dxa" w:w="1904"/>
+            <w:tcW w:w="1904" w:type="dxa"/>
           </w:tcPr>
           <w:p>
             <w:r>
@@ -17465,7 +17419,7 @@
         </w:tc>
         <w:tc>
           <w:tcPr>
-            <w:tcW w:type="dxa" w:w="1904"/>
+            <w:tcW w:w="1904" w:type="dxa"/>
           </w:tcPr>
           <w:p>
             <w:r>
@@ -17480,7 +17434,7 @@
       <w:tr>
         <w:tc>
           <w:tcPr>
-            <w:tcW w:type="dxa" w:w="1904"/>
+            <w:tcW w:w="1904" w:type="dxa"/>
           </w:tcPr>
           <w:p>
             <w:r>
@@ -17490,7 +17444,7 @@
         </w:tc>
         <w:tc>
           <w:tcPr>
-            <w:tcW w:type="dxa" w:w="1904"/>
+            <w:tcW w:w="1904" w:type="dxa"/>
           </w:tcPr>
           <w:p>
             <w:r>
@@ -17500,7 +17454,7 @@
         </w:tc>
         <w:tc>
           <w:tcPr>
-            <w:tcW w:type="dxa" w:w="1904"/>
+            <w:tcW w:w="1904" w:type="dxa"/>
           </w:tcPr>
           <w:p>
             <w:r>
@@ -17510,7 +17464,7 @@
         </w:tc>
         <w:tc>
           <w:tcPr>
-            <w:tcW w:type="dxa" w:w="1904"/>
+            <w:tcW w:w="1904" w:type="dxa"/>
           </w:tcPr>
           <w:p>
             <w:r>
@@ -17520,7 +17474,7 @@
         </w:tc>
         <w:tc>
           <w:tcPr>
-            <w:tcW w:type="dxa" w:w="1904"/>
+            <w:tcW w:w="1904" w:type="dxa"/>
           </w:tcPr>
           <w:p>
             <w:r>
@@ -17532,7 +17486,7 @@
       <w:tr>
         <w:tc>
           <w:tcPr>
-            <w:tcW w:type="dxa" w:w="1904"/>
+            <w:tcW w:w="1904" w:type="dxa"/>
           </w:tcPr>
           <w:p>
             <w:r>
@@ -17542,7 +17496,7 @@
         </w:tc>
         <w:tc>
           <w:tcPr>
-            <w:tcW w:type="dxa" w:w="1904"/>
+            <w:tcW w:w="1904" w:type="dxa"/>
           </w:tcPr>
           <w:p>
             <w:r>
@@ -17552,7 +17506,7 @@
         </w:tc>
         <w:tc>
           <w:tcPr>
-            <w:tcW w:type="dxa" w:w="1904"/>
+            <w:tcW w:w="1904" w:type="dxa"/>
           </w:tcPr>
           <w:p>
             <w:r>
@@ -17562,7 +17516,7 @@
         </w:tc>
         <w:tc>
           <w:tcPr>
-            <w:tcW w:type="dxa" w:w="1904"/>
+            <w:tcW w:w="1904" w:type="dxa"/>
           </w:tcPr>
           <w:p>
             <w:r>
@@ -17572,7 +17526,7 @@
         </w:tc>
         <w:tc>
           <w:tcPr>
-            <w:tcW w:type="dxa" w:w="1904"/>
+            <w:tcW w:w="1904" w:type="dxa"/>
           </w:tcPr>
           <w:p>
             <w:r>
@@ -17584,7 +17538,7 @@
       <w:tr>
         <w:tc>
           <w:tcPr>
-            <w:tcW w:type="dxa" w:w="1904"/>
+            <w:tcW w:w="1904" w:type="dxa"/>
           </w:tcPr>
           <w:p>
             <w:r>
@@ -17594,7 +17548,7 @@
         </w:tc>
         <w:tc>
           <w:tcPr>
-            <w:tcW w:type="dxa" w:w="1904"/>
+            <w:tcW w:w="1904" w:type="dxa"/>
           </w:tcPr>
           <w:p>
             <w:r>
@@ -17604,7 +17558,7 @@
         </w:tc>
         <w:tc>
           <w:tcPr>
-            <w:tcW w:type="dxa" w:w="1904"/>
+            <w:tcW w:w="1904" w:type="dxa"/>
           </w:tcPr>
           <w:p>
             <w:r>
@@ -17614,7 +17568,7 @@
         </w:tc>
         <w:tc>
           <w:tcPr>
-            <w:tcW w:type="dxa" w:w="1904"/>
+            <w:tcW w:w="1904" w:type="dxa"/>
           </w:tcPr>
           <w:p>
             <w:r>
@@ -17624,7 +17578,7 @@
         </w:tc>
         <w:tc>
           <w:tcPr>
-            <w:tcW w:type="dxa" w:w="1904"/>
+            <w:tcW w:w="1904" w:type="dxa"/>
           </w:tcPr>
           <w:p>
             <w:r>
@@ -17636,7 +17590,7 @@
       <w:tr>
         <w:tc>
           <w:tcPr>
-            <w:tcW w:type="dxa" w:w="1904"/>
+            <w:tcW w:w="1904" w:type="dxa"/>
           </w:tcPr>
           <w:p>
             <w:r>
@@ -17646,7 +17600,7 @@
         </w:tc>
         <w:tc>
           <w:tcPr>
-            <w:tcW w:type="dxa" w:w="1904"/>
+            <w:tcW w:w="1904" w:type="dxa"/>
           </w:tcPr>
           <w:p>
             <w:r>
@@ -17656,7 +17610,7 @@
         </w:tc>
         <w:tc>
           <w:tcPr>
-            <w:tcW w:type="dxa" w:w="1904"/>
+            <w:tcW w:w="1904" w:type="dxa"/>
           </w:tcPr>
           <w:p>
             <w:r>
@@ -17666,7 +17620,7 @@
         </w:tc>
         <w:tc>
           <w:tcPr>
-            <w:tcW w:type="dxa" w:w="1904"/>
+            <w:tcW w:w="1904" w:type="dxa"/>
           </w:tcPr>
           <w:p>
             <w:r>
@@ -17676,7 +17630,7 @@
         </w:tc>
         <w:tc>
           <w:tcPr>
-            <w:tcW w:type="dxa" w:w="1904"/>
+            <w:tcW w:w="1904" w:type="dxa"/>
           </w:tcPr>
           <w:p>
             <w:r>
@@ -17687,13 +17641,11 @@
       </w:tr>
     </w:tbl>
     <w:p>
-      <w:pPr/>
       <w:r>
         <w:t>Table 16. Interpretation-count ablation, full 100% SIGN Train family set, both models.</w:t>
       </w:r>
     </w:p>
     <w:p>
-      <w:pPr/>
       <w:r>
         <w:t>The sharpest model contrast in the whole project. For M1, more interpretation diversity buys Task B gains at an increasingly steep Task A cost (74.7%→55.9%, a real trade-off - k=1 is not dominated by higher k). For M6, the identical manipulation improves Task B by even more (0.687→0.740) with no comparable Task A cost (stays in a tight 77.7-81.5% band) - k=5 is close to strictly better than k=1 for M6. The same pattern - capacity-limited model forced into a trade-off, fine-tuned model absorbing added diversity almost for free - recurs across §4.7, §4.8, and §4.9 independently, making it the project's most robust finding about how domain adaptation should be approached differently depending on model class.</w:t>
       </w:r>
@@ -17702,12 +17654,14 @@
       <w:pPr>
         <w:pStyle w:val="Heading2"/>
       </w:pPr>
-      <w:r>
+      <w:bookmarkStart w:id="50" w:name="_Toc238317457"/>
+      <w:r>
+        <w:lastRenderedPageBreak/>
         <w:t>4.10 Remaining Difficult Cases After Adaptation</w:t>
       </w:r>
-    </w:p>
-    <w:p>
-      <w:pPr/>
+      <w:bookmarkEnd w:id="50"/>
+    </w:p>
+    <w:p>
       <w:r>
         <w:t>Even after the winning adaptation recipe (condition B, §4.7), both models still leave real gaps. M1: 41 of 265 originals still missed after adaptation (plus 26 newly broken by the adaptation itself), and 483 of 1,470 interpretations still misclassified as sarcastic. M6: 35 of 265 originals still missed (plus 22 newly broken), and 257 of 1,470 interpretations still misclassified. Some fraction of both models' remaining Task B errors is the irreducible duplicate-interpretation data-quality ceiling from §4.6, not a closable modeling gap. The residual errors are concentrated in the same context/world-knowledge-dependent cases identified in §4.5 - adaptation closes most of the distributional gap between Dataset A and SIGN, but does not resolve cases that require information outside the text itself.</w:t>
       </w:r>
@@ -17716,12 +17670,13 @@
       <w:pPr>
         <w:pStyle w:val="Heading2"/>
       </w:pPr>
+      <w:bookmarkStart w:id="51" w:name="_Toc238317458"/>
       <w:r>
         <w:t>4.11 Part III Conclusions</w:t>
       </w:r>
-    </w:p>
-    <w:p>
-      <w:pPr/>
+      <w:bookmarkEnd w:id="51"/>
+    </w:p>
+    <w:p>
       <w:r>
         <w:t>Sarcasm detection (Task A) transfers reasonably well across the Dataset A to SIGN domain shift, even zero-shot; the real generalization challenge is Task B - telling a sarcastic original apart from a sincere rewrite of the same underlying meaning - made harder by a genuine data-quality ceiling in a meaningful minority of SIGN's interpretations. Combining a modest amount of SIGN Train data with the original training data (never replacing it) closes most of this gap at essentially zero cost to Dataset A performance, for both a classical and a fine-tuned model. The most consequential finding for future work is the consistent model-capacity contrast across every adaptation experiment: a capacity-limited linear model (M1) is forced into a real Task A/Task B trade-off as it is given more SIGN signal, while a fine-tuned transformer (M6) absorbs the same additional signal with little to no such trade-off - evidence that how a model should be adapted to a shifted domain depends on its capacity, not just on how much adaptation data is available. Separately, SIGN's Task A result (Qwen3-4B detecting 93.6% of sarcastic originals zero-shot, far above its own Dataset A Macro F1 would suggest) reframes Part II's open model-vs-approach question: the evidence now points toward a calibration limitation in prompted binary classification specifically, not a fundamental inability of the base LLM to recognize sarcasm.</w:t>
       </w:r>
@@ -17731,12 +17686,21 @@
         <w:pStyle w:val="Heading1"/>
         <w:spacing w:line="360" w:lineRule="auto"/>
       </w:pPr>
-      <w:bookmarkStart w:id="40" w:name="_Toc237877566"/>
+      <w:r>
+        <w:br w:type="page"/>
+      </w:r>
+    </w:p>
+    <w:p>
+      <w:pPr>
+        <w:pStyle w:val="Heading1"/>
+        <w:spacing w:line="360" w:lineRule="auto"/>
+      </w:pPr>
+      <w:bookmarkStart w:id="52" w:name="_Toc238317459"/>
       <w:r>
         <w:lastRenderedPageBreak/>
         <w:t>5. Overall Project Conclusions</w:t>
       </w:r>
-      <w:bookmarkEnd w:id="40"/>
+      <w:bookmarkEnd w:id="52"/>
     </w:p>
     <w:p>
       <w:pPr>
@@ -17886,314 +17850,12 @@
         <w:pStyle w:val="Heading1"/>
         <w:spacing w:line="360" w:lineRule="auto"/>
       </w:pPr>
-      <w:bookmarkStart w:id="41" w:name="_Toc237877567"/>
+      <w:bookmarkStart w:id="53" w:name="_Toc238317460"/>
       <w:r>
         <w:lastRenderedPageBreak/>
-        <w:t>6. Reproducibility</w:t>
-      </w:r>
-      <w:bookmarkEnd w:id="41"/>
-    </w:p>
-    <w:p>
-      <w:pPr>
-        <w:spacing w:line="360" w:lineRule="auto"/>
-      </w:pPr>
-      <w:r>
-        <w:t>Every experiment's configuration, metrics, and per-example predictions are saved under results/&lt;experiment_id&gt;/ in the project repository. The general shape of a full reproduction is:</w:t>
-      </w:r>
-    </w:p>
-    <w:p>
-      <w:pPr>
-        <w:spacing w:line="360" w:lineRule="auto"/>
-        <w:rPr>
-          <w:rFonts w:cs="Calibri"/>
-        </w:rPr>
-      </w:pPr>
-      <w:r>
-        <w:rPr>
-          <w:rFonts w:cs="Calibri"/>
-        </w:rPr>
-        <w:t>Reproducibility here means something stricter than the code being available. Every experiment is driven by a version-controlled configuration file rather than by command-line arguments typed at run time, so the exact settings behind any reported number are recoverable from the repository rather than from memory. The dataset pipeline is deterministic and non-destructive: the raw corpus files are read-only, the canonical table is rebuilt from them rather than edited in place, and the split is generated from a fixed seed, so re-running the three data commands on a clean checkout reproduces byte-identical splits. Metrics and per-example predictions are written to a per-experiment results directory rather than reported only in a log, which is what allows the cross-method and error analyses in Sections 3.7 and 3.8 to be recomputed independently of the runs that produced them.</w:t>
-      </w:r>
-    </w:p>
-    <w:p>
-      <w:pPr>
-        <w:spacing w:after="120" w:line="360" w:lineRule="auto"/>
-        <w:rPr>
-          <w:rFonts w:cs="Calibri"/>
-        </w:rPr>
-      </w:pPr>
-      <w:r>
-        <w:rPr>
-          <w:rFonts w:cs="Calibri"/>
-        </w:rPr>
-        <w:t xml:space="preserve">One asymmetry in the commands below is deliberate and worth noting. Every approach except the fine-tuned encoder is evaluated through the same experiment runner; the encoder required a separate evaluation-only script because its training script has no path for loading an existing checkpoint and scoring it without retraining. Re-running the trainer against the test split would have produced a fresh model rather than an evaluation of the frozen one, which would have violated the sealing policy at the very last step. The separate script exists to keep that guarantee intact </w:t>
-      </w:r>
-      <w:r>
-        <w:rPr>
-          <w:rFonts w:cs="Calibri"/>
-        </w:rPr>
-        <w:t>-</w:t>
-      </w:r>
-      <w:r>
-        <w:rPr>
-          <w:rFonts w:cs="Calibri"/>
-        </w:rPr>
-        <w:t xml:space="preserve"> the checkpoint evaluated on the test set is exactly the checkpoint selected on the development set, with no further training in between.</w:t>
-      </w:r>
-    </w:p>
-    <w:p>
-      <w:pPr>
-        <w:spacing w:after="0" w:line="360" w:lineRule="auto"/>
-      </w:pPr>
-      <w:r>
-        <w:rPr>
-          <w:rFonts w:ascii="Consolas" w:hAnsi="Consolas"/>
-          <w:color w:val="1A1A1A"/>
-          <w:sz w:val="18"/>
-        </w:rPr>
-        <w:t># 0. Install dependencies (base + Part II extras)</w:t>
-      </w:r>
-      <w:r>
-        <w:rPr>
-          <w:rFonts w:ascii="Consolas" w:hAnsi="Consolas"/>
-          <w:color w:val="1A1A1A"/>
-          <w:sz w:val="18"/>
-        </w:rPr>
-        <w:br/>
-        <w:t>pip install -r requirements.txt -r requirements-classification.txt</w:t>
-      </w:r>
-      <w:r>
-        <w:rPr>
-          <w:rFonts w:ascii="Consolas" w:hAnsi="Consolas"/>
-          <w:color w:val="1A1A1A"/>
-          <w:sz w:val="18"/>
-        </w:rPr>
-        <w:br/>
-        <w:t xml:space="preserve"> </w:t>
-      </w:r>
-      <w:r>
-        <w:rPr>
-          <w:rFonts w:ascii="Consolas" w:hAnsi="Consolas"/>
-          <w:color w:val="1A1A1A"/>
-          <w:sz w:val="18"/>
-        </w:rPr>
-        <w:br/>
-        <w:t># 1. Build the canonical dataset (from data/raw/sarcasm_corpus_v2/, read-only)</w:t>
-      </w:r>
-      <w:r>
-        <w:rPr>
-          <w:rFonts w:ascii="Consolas" w:hAnsi="Consolas"/>
-          <w:color w:val="1A1A1A"/>
-          <w:sz w:val="18"/>
-        </w:rPr>
-        <w:br/>
-        <w:t>python -m src.classification.data.build_canonical_dataset</w:t>
-      </w:r>
-      <w:r>
-        <w:rPr>
-          <w:rFonts w:ascii="Consolas" w:hAnsi="Consolas"/>
-          <w:color w:val="1A1A1A"/>
-          <w:sz w:val="18"/>
-        </w:rPr>
-        <w:br/>
-        <w:t>python -m src.classification.data.audit_dataset</w:t>
-      </w:r>
-      <w:r>
-        <w:rPr>
-          <w:rFonts w:ascii="Consolas" w:hAnsi="Consolas"/>
-          <w:color w:val="1A1A1A"/>
-          <w:sz w:val="18"/>
-        </w:rPr>
-        <w:br/>
-        <w:t>python -m src.classification.data.make_splits</w:t>
-      </w:r>
-      <w:r>
-        <w:rPr>
-          <w:rFonts w:ascii="Consolas" w:hAnsi="Consolas"/>
-          <w:color w:val="1A1A1A"/>
-          <w:sz w:val="18"/>
-        </w:rPr>
-        <w:br/>
-        <w:t xml:space="preserve"> </w:t>
-      </w:r>
-      <w:r>
-        <w:rPr>
-          <w:rFonts w:ascii="Consolas" w:hAnsi="Consolas"/>
-          <w:color w:val="1A1A1A"/>
-          <w:sz w:val="18"/>
-        </w:rPr>
-        <w:br/>
-        <w:t># 2. DEV-phase development run (any approach, via its config file under configs/)</w:t>
-      </w:r>
-      <w:r>
-        <w:rPr>
-          <w:rFonts w:ascii="Consolas" w:hAnsi="Consolas"/>
-          <w:color w:val="1A1A1A"/>
-          <w:sz w:val="18"/>
-        </w:rPr>
-        <w:br/>
-        <w:t>python -m src.classification.run_experiment --config configs/tfidf.json</w:t>
-      </w:r>
-      <w:r>
-        <w:rPr>
-          <w:rFonts w:ascii="Consolas" w:hAnsi="Consolas"/>
-          <w:color w:val="1A1A1A"/>
-          <w:sz w:val="18"/>
-        </w:rPr>
-        <w:br/>
-        <w:t>python -m src.classification.run_experiment --config configs/llm_zero_shot_qwen_local.json</w:t>
-      </w:r>
-      <w:r>
-        <w:rPr>
-          <w:rFonts w:ascii="Consolas" w:hAnsi="Consolas"/>
-          <w:color w:val="1A1A1A"/>
-          <w:sz w:val="18"/>
-        </w:rPr>
-        <w:br/>
-        <w:t>python -m src.classification.run_experiment --config configs/dspy_mipro_v2.json</w:t>
-      </w:r>
-      <w:r>
-        <w:rPr>
-          <w:rFonts w:ascii="Consolas" w:hAnsi="Consolas"/>
-          <w:color w:val="1A1A1A"/>
-          <w:sz w:val="18"/>
-        </w:rPr>
-        <w:br/>
-        <w:t>python -m src.classification.run_experiment --config configs/transformer_deberta_v3_base.json</w:t>
-      </w:r>
-      <w:r>
-        <w:rPr>
-          <w:rFonts w:ascii="Consolas" w:hAnsi="Consolas"/>
-          <w:color w:val="1A1A1A"/>
-          <w:sz w:val="18"/>
-        </w:rPr>
-        <w:br/>
-        <w:t xml:space="preserve"> </w:t>
-      </w:r>
-      <w:r>
-        <w:rPr>
-          <w:rFonts w:ascii="Consolas" w:hAnsi="Consolas"/>
-          <w:color w:val="1A1A1A"/>
-          <w:sz w:val="18"/>
-        </w:rPr>
-        <w:br/>
-        <w:t># 3. Once frozen, the final one-shot TEST evaluation</w:t>
-      </w:r>
-      <w:r>
-        <w:rPr>
-          <w:rFonts w:ascii="Consolas" w:hAnsi="Consolas"/>
-          <w:color w:val="1A1A1A"/>
-          <w:sz w:val="18"/>
-        </w:rPr>
-        <w:br/>
-      </w:r>
-      <w:r>
-        <w:rPr>
-          <w:rFonts w:ascii="Consolas" w:hAnsi="Consolas"/>
-          <w:color w:val="1A1A1A"/>
-          <w:sz w:val="18"/>
-        </w:rPr>
-        <w:lastRenderedPageBreak/>
-        <w:t>python -m src.classification.run_experiment --config configs/EXP-008-TEST.json</w:t>
-      </w:r>
-      <w:r>
-        <w:rPr>
-          <w:rFonts w:ascii="Consolas" w:hAnsi="Consolas"/>
-          <w:color w:val="1A1A1A"/>
-          <w:sz w:val="18"/>
-        </w:rPr>
-        <w:br/>
-        <w:t># M6 uses an eval-only script instead (no retraining against an already-frozen checkpoint):</w:t>
-      </w:r>
-      <w:r>
-        <w:rPr>
-          <w:rFonts w:ascii="Consolas" w:hAnsi="Consolas"/>
-          <w:color w:val="1A1A1A"/>
-          <w:sz w:val="18"/>
-        </w:rPr>
-        <w:br/>
-        <w:t>python -m scripts.eval_frozen_checkpoint --checkpoint-dir models/EXP-009/best_checkpoint \</w:t>
-      </w:r>
-      <w:r>
-        <w:rPr>
-          <w:rFonts w:ascii="Consolas" w:hAnsi="Consolas"/>
-          <w:color w:val="1A1A1A"/>
-          <w:sz w:val="18"/>
-        </w:rPr>
-        <w:br/>
-        <w:t xml:space="preserve">    --split test --experiment-id EXP-009-TEST --source-experiment-id EXP-009</w:t>
-      </w:r>
-      <w:r>
-        <w:rPr>
-          <w:rFonts w:ascii="Consolas" w:hAnsi="Consolas"/>
-          <w:color w:val="1A1A1A"/>
-          <w:sz w:val="18"/>
-        </w:rPr>
-        <w:br/>
-      </w:r>
-    </w:p>
-    <w:p>
-      <w:pPr>
-        <w:spacing w:before="240" w:after="120" w:line="360" w:lineRule="auto"/>
-      </w:pPr>
-      <w:r>
-        <w:t>Run the test suite (never calls a real API or downloads a model):</w:t>
-      </w:r>
-    </w:p>
-    <w:p>
-      <w:pPr>
-        <w:spacing w:after="0" w:line="360" w:lineRule="auto"/>
-      </w:pPr>
-      <w:r>
-        <w:rPr>
-          <w:rFonts w:ascii="Consolas" w:hAnsi="Consolas"/>
-          <w:sz w:val="18"/>
-        </w:rPr>
-        <w:t>pip install -r requirements.txt -r requirements-dev.txt</w:t>
-      </w:r>
-      <w:r>
-        <w:rPr>
-          <w:rFonts w:ascii="Consolas" w:hAnsi="Consolas"/>
-          <w:sz w:val="18"/>
-        </w:rPr>
-        <w:br/>
-        <w:t>pytest</w:t>
-      </w:r>
-      <w:r>
-        <w:rPr>
-          <w:rFonts w:ascii="Consolas" w:hAnsi="Consolas"/>
-          <w:sz w:val="18"/>
-        </w:rPr>
-        <w:br/>
-      </w:r>
-    </w:p>
-    <w:p>
-      <w:pPr>
-        <w:spacing w:before="240" w:line="360" w:lineRule="auto"/>
-      </w:pPr>
-      <w:r>
-        <w:t>Part I is reproduced via README.md's "Running Phase 1" section; Part II's exact command and configuration for every result in this report is recorded, method by method, in EXPERIMENT_LOG.md.</w:t>
-      </w:r>
-    </w:p>
-    <w:p>
-      <w:pPr>
-        <w:spacing w:line="360" w:lineRule="auto"/>
-      </w:pPr>
-      <w:r>
-        <w:br w:type="page"/>
-      </w:r>
-    </w:p>
-    <w:p>
-      <w:pPr>
-        <w:pStyle w:val="Heading1"/>
-        <w:spacing w:line="360" w:lineRule="auto"/>
-      </w:pPr>
-      <w:bookmarkStart w:id="42" w:name="_Toc237877568"/>
-      <w:r>
-        <w:lastRenderedPageBreak/>
-        <w:t>7. References</w:t>
-      </w:r>
-      <w:bookmarkEnd w:id="42"/>
+        <w:t>6. References</w:t>
+      </w:r>
+      <w:bookmarkEnd w:id="53"/>
     </w:p>
     <w:p>
       <w:pPr>

</xml_diff>